<commit_message>
Aggiunta documentazione più conclusione report
</commit_message>
<xml_diff>
--- a/Codice_Tesi/Report Tesi.docx
+++ b/Codice_Tesi/Report Tesi.docx
@@ -64,7 +64,23 @@
           <w:sz w:val="24"/>
           <w:szCs w:val="24"/>
         </w:rPr>
-        <w:t xml:space="preserve">Per quanto riguarda il codice(presente nel </w:t>
+        <w:t xml:space="preserve">Per quanto riguarda il </w:t>
+      </w:r>
+      <w:proofErr w:type="gramStart"/>
+      <w:r>
+        <w:rPr>
+          <w:sz w:val="24"/>
+          <w:szCs w:val="24"/>
+        </w:rPr>
+        <w:t>codice(</w:t>
+      </w:r>
+      <w:proofErr w:type="gramEnd"/>
+      <w:r>
+        <w:rPr>
+          <w:sz w:val="24"/>
+          <w:szCs w:val="24"/>
+        </w:rPr>
+        <w:t xml:space="preserve">presente nel </w:t>
       </w:r>
       <w:proofErr w:type="spellStart"/>
       <w:r>
@@ -136,6 +152,7 @@
         <w:t xml:space="preserve"> datami dal </w:t>
       </w:r>
       <w:proofErr w:type="spellStart"/>
+      <w:proofErr w:type="gramStart"/>
       <w:r>
         <w:rPr>
           <w:sz w:val="24"/>
@@ -144,6 +161,7 @@
         <w:t>Dr.Carnemolla</w:t>
       </w:r>
       <w:proofErr w:type="spellEnd"/>
+      <w:proofErr w:type="gramEnd"/>
       <w:r>
         <w:rPr>
           <w:sz w:val="24"/>
@@ -513,7 +531,29 @@
           <w:szCs w:val="21"/>
           <w:lang w:val="en-US" w:eastAsia="it-IT"/>
         </w:rPr>
-        <w:t>"seg_0"</w:t>
+        <w:t>"</w:t>
+      </w:r>
+      <w:proofErr w:type="gramStart"/>
+      <w:r>
+        <w:rPr>
+          <w:rFonts w:ascii="Consolas" w:eastAsia="Times New Roman" w:hAnsi="Consolas" w:cs="Times New Roman"/>
+          <w:color w:val="9CDCFE"/>
+          <w:sz w:val="21"/>
+          <w:szCs w:val="21"/>
+          <w:lang w:val="en-US" w:eastAsia="it-IT"/>
+        </w:rPr>
+        <w:t>seg</w:t>
+      </w:r>
+      <w:proofErr w:type="gramEnd"/>
+      <w:r>
+        <w:rPr>
+          <w:rFonts w:ascii="Consolas" w:eastAsia="Times New Roman" w:hAnsi="Consolas" w:cs="Times New Roman"/>
+          <w:color w:val="9CDCFE"/>
+          <w:sz w:val="21"/>
+          <w:szCs w:val="21"/>
+          <w:lang w:val="en-US" w:eastAsia="it-IT"/>
+        </w:rPr>
+        <w:t>_0"</w:t>
       </w:r>
       <w:r>
         <w:rPr>
@@ -695,7 +735,29 @@
           <w:szCs w:val="21"/>
           <w:lang w:val="en-US" w:eastAsia="it-IT"/>
         </w:rPr>
-        <w:t>"seg_1"</w:t>
+        <w:t>"</w:t>
+      </w:r>
+      <w:proofErr w:type="gramStart"/>
+      <w:r>
+        <w:rPr>
+          <w:rFonts w:ascii="Consolas" w:eastAsia="Times New Roman" w:hAnsi="Consolas" w:cs="Times New Roman"/>
+          <w:color w:val="9CDCFE"/>
+          <w:sz w:val="21"/>
+          <w:szCs w:val="21"/>
+          <w:lang w:val="en-US" w:eastAsia="it-IT"/>
+        </w:rPr>
+        <w:t>seg</w:t>
+      </w:r>
+      <w:proofErr w:type="gramEnd"/>
+      <w:r>
+        <w:rPr>
+          <w:rFonts w:ascii="Consolas" w:eastAsia="Times New Roman" w:hAnsi="Consolas" w:cs="Times New Roman"/>
+          <w:color w:val="9CDCFE"/>
+          <w:sz w:val="21"/>
+          <w:szCs w:val="21"/>
+          <w:lang w:val="en-US" w:eastAsia="it-IT"/>
+        </w:rPr>
+        <w:t>_1"</w:t>
       </w:r>
       <w:r>
         <w:rPr>
@@ -966,7 +1028,29 @@
           <w:szCs w:val="21"/>
           <w:lang w:val="en-US" w:eastAsia="it-IT"/>
         </w:rPr>
-        <w:t>"seg_5"</w:t>
+        <w:t>"</w:t>
+      </w:r>
+      <w:proofErr w:type="gramStart"/>
+      <w:r>
+        <w:rPr>
+          <w:rFonts w:ascii="Consolas" w:eastAsia="Times New Roman" w:hAnsi="Consolas" w:cs="Times New Roman"/>
+          <w:color w:val="9CDCFE"/>
+          <w:sz w:val="21"/>
+          <w:szCs w:val="21"/>
+          <w:lang w:val="en-US" w:eastAsia="it-IT"/>
+        </w:rPr>
+        <w:t>seg</w:t>
+      </w:r>
+      <w:proofErr w:type="gramEnd"/>
+      <w:r>
+        <w:rPr>
+          <w:rFonts w:ascii="Consolas" w:eastAsia="Times New Roman" w:hAnsi="Consolas" w:cs="Times New Roman"/>
+          <w:color w:val="9CDCFE"/>
+          <w:sz w:val="21"/>
+          <w:szCs w:val="21"/>
+          <w:lang w:val="en-US" w:eastAsia="it-IT"/>
+        </w:rPr>
+        <w:t>_5"</w:t>
       </w:r>
       <w:r>
         <w:rPr>
@@ -1148,7 +1232,29 @@
           <w:szCs w:val="21"/>
           <w:lang w:val="en-US" w:eastAsia="it-IT"/>
         </w:rPr>
-        <w:t>"seg_6"</w:t>
+        <w:t>"</w:t>
+      </w:r>
+      <w:proofErr w:type="gramStart"/>
+      <w:r>
+        <w:rPr>
+          <w:rFonts w:ascii="Consolas" w:eastAsia="Times New Roman" w:hAnsi="Consolas" w:cs="Times New Roman"/>
+          <w:color w:val="9CDCFE"/>
+          <w:sz w:val="21"/>
+          <w:szCs w:val="21"/>
+          <w:lang w:val="en-US" w:eastAsia="it-IT"/>
+        </w:rPr>
+        <w:t>seg</w:t>
+      </w:r>
+      <w:proofErr w:type="gramEnd"/>
+      <w:r>
+        <w:rPr>
+          <w:rFonts w:ascii="Consolas" w:eastAsia="Times New Roman" w:hAnsi="Consolas" w:cs="Times New Roman"/>
+          <w:color w:val="9CDCFE"/>
+          <w:sz w:val="21"/>
+          <w:szCs w:val="21"/>
+          <w:lang w:val="en-US" w:eastAsia="it-IT"/>
+        </w:rPr>
+        <w:t>_6"</w:t>
       </w:r>
       <w:r>
         <w:rPr>
@@ -1286,7 +1392,7 @@
           <w:color w:val="CCCCCC"/>
           <w:sz w:val="21"/>
           <w:szCs w:val="21"/>
-          <w:lang w:eastAsia="it-IT"/>
+          <w:lang w:val="en-US" w:eastAsia="it-IT"/>
         </w:rPr>
       </w:pPr>
       <w:r>
@@ -1309,7 +1415,7 @@
           <w:color w:val="CCCCCC"/>
           <w:sz w:val="21"/>
           <w:szCs w:val="21"/>
-          <w:lang w:eastAsia="it-IT"/>
+          <w:lang w:val="en-US" w:eastAsia="it-IT"/>
         </w:rPr>
       </w:pPr>
       <w:r>
@@ -1318,7 +1424,7 @@
           <w:color w:val="CCCCCC"/>
           <w:sz w:val="21"/>
           <w:szCs w:val="21"/>
-          <w:lang w:eastAsia="it-IT"/>
+          <w:lang w:val="en-US" w:eastAsia="it-IT"/>
         </w:rPr>
         <w:t>        }</w:t>
       </w:r>
@@ -1332,7 +1438,7 @@
           <w:color w:val="CCCCCC"/>
           <w:sz w:val="21"/>
           <w:szCs w:val="21"/>
-          <w:lang w:eastAsia="it-IT"/>
+          <w:lang w:val="en-US" w:eastAsia="it-IT"/>
         </w:rPr>
       </w:pPr>
       <w:r>
@@ -1341,7 +1447,7 @@
           <w:color w:val="CCCCCC"/>
           <w:sz w:val="21"/>
           <w:szCs w:val="21"/>
-          <w:lang w:eastAsia="it-IT"/>
+          <w:lang w:val="en-US" w:eastAsia="it-IT"/>
         </w:rPr>
         <w:t>      }</w:t>
       </w:r>
@@ -1355,7 +1461,7 @@
           <w:color w:val="CCCCCC"/>
           <w:sz w:val="21"/>
           <w:szCs w:val="21"/>
-          <w:lang w:eastAsia="it-IT"/>
+          <w:lang w:val="en-US" w:eastAsia="it-IT"/>
         </w:rPr>
       </w:pPr>
       <w:r>
@@ -1364,7 +1470,7 @@
           <w:color w:val="CCCCCC"/>
           <w:sz w:val="21"/>
           <w:szCs w:val="21"/>
-          <w:lang w:eastAsia="it-IT"/>
+          <w:lang w:val="en-US" w:eastAsia="it-IT"/>
         </w:rPr>
         <w:t>    },</w:t>
       </w:r>
@@ -1378,7 +1484,7 @@
           <w:color w:val="CCCCCC"/>
           <w:sz w:val="21"/>
           <w:szCs w:val="21"/>
-          <w:lang w:eastAsia="it-IT"/>
+          <w:lang w:val="en-US" w:eastAsia="it-IT"/>
         </w:rPr>
       </w:pPr>
       <w:r>
@@ -1387,7 +1493,7 @@
           <w:color w:val="CCCCCC"/>
           <w:sz w:val="21"/>
           <w:szCs w:val="21"/>
-          <w:lang w:eastAsia="it-IT"/>
+          <w:lang w:val="en-US" w:eastAsia="it-IT"/>
         </w:rPr>
         <w:tab/>
       </w:r>
@@ -1397,7 +1503,7 @@
           <w:color w:val="9CDCFE"/>
           <w:sz w:val="21"/>
           <w:szCs w:val="21"/>
-          <w:lang w:eastAsia="it-IT"/>
+          <w:lang w:val="en-US" w:eastAsia="it-IT"/>
         </w:rPr>
         <w:t>"h1.csv"</w:t>
       </w:r>
@@ -1407,19 +1513,9 @@
           <w:color w:val="CCCCCC"/>
           <w:sz w:val="21"/>
           <w:szCs w:val="21"/>
-          <w:lang w:eastAsia="it-IT"/>
-        </w:rPr>
-        <w:t xml:space="preserve">: </w:t>
-      </w:r>
-      <w:r>
-        <w:rPr>
-          <w:rFonts w:ascii="Consolas" w:eastAsia="Times New Roman" w:hAnsi="Consolas" w:cs="Times New Roman"/>
-          <w:color w:val="CCCCCC"/>
-          <w:sz w:val="21"/>
-          <w:szCs w:val="21"/>
-          <w:lang w:eastAsia="it-IT"/>
-        </w:rPr>
-        <w:t>…</w:t>
+          <w:lang w:val="en-US" w:eastAsia="it-IT"/>
+        </w:rPr>
+        <w:t>: …</w:t>
       </w:r>
     </w:p>
     <w:p>
@@ -1431,7 +1527,7 @@
           <w:color w:val="CCCCCC"/>
           <w:sz w:val="21"/>
           <w:szCs w:val="21"/>
-          <w:lang w:eastAsia="it-IT"/>
+          <w:lang w:val="en-US" w:eastAsia="it-IT"/>
         </w:rPr>
       </w:pPr>
     </w:p>
@@ -1441,6 +1537,7 @@
         <w:rPr>
           <w:sz w:val="30"/>
           <w:szCs w:val="30"/>
+          <w:lang w:val="en-US"/>
         </w:rPr>
       </w:pPr>
     </w:p>
@@ -1458,9 +1555,18 @@
           <w:szCs w:val="24"/>
         </w:rPr>
         <w:lastRenderedPageBreak/>
-        <w:t>Innanzitutto ho creato un piccolo algoritmo che unisse tutti i file audio in un'unica cartella a prescindere dalla superclasse(</w:t>
-      </w:r>
-      <w:proofErr w:type="spellStart"/>
+        <w:t xml:space="preserve">Innanzitutto ho creato un piccolo algoritmo che unisse tutti i file audio in un'unica cartella a prescindere dalla </w:t>
+      </w:r>
+      <w:proofErr w:type="gramStart"/>
+      <w:r>
+        <w:rPr>
+          <w:sz w:val="24"/>
+          <w:szCs w:val="24"/>
+        </w:rPr>
+        <w:t>superclasse(</w:t>
+      </w:r>
+      <w:proofErr w:type="spellStart"/>
+      <w:proofErr w:type="gramEnd"/>
       <w:r>
         <w:rPr>
           <w:sz w:val="24"/>
@@ -1570,30 +1676,39 @@
           <w:sz w:val="24"/>
           <w:szCs w:val="24"/>
         </w:rPr>
-        <w:t xml:space="preserve"> è la seguente</w:t>
-      </w:r>
-      <w:r>
-        <w:rPr>
-          <w:sz w:val="24"/>
-          <w:szCs w:val="24"/>
-        </w:rPr>
-        <w:t>:</w:t>
-      </w:r>
-    </w:p>
-    <w:p>
-      <w:pPr>
-        <w:jc w:val="both"/>
-        <w:rPr>
-          <w:sz w:val="24"/>
-          <w:szCs w:val="24"/>
-        </w:rPr>
-      </w:pPr>
-      <w:r>
-        <w:rPr>
-          <w:sz w:val="24"/>
-          <w:szCs w:val="24"/>
-        </w:rPr>
-        <w:t>{classe1:{audio1:[start_evento1,fine_evento1][start_evento2,end_evento2],audio2:[]…}, classe2:{…}</w:t>
+        <w:t xml:space="preserve"> è la seguente:</w:t>
+      </w:r>
+    </w:p>
+    <w:p>
+      <w:pPr>
+        <w:jc w:val="both"/>
+        <w:rPr>
+          <w:sz w:val="24"/>
+          <w:szCs w:val="24"/>
+        </w:rPr>
+      </w:pPr>
+      <w:r>
+        <w:rPr>
+          <w:sz w:val="24"/>
+          <w:szCs w:val="24"/>
+        </w:rPr>
+        <w:t>{classe</w:t>
+      </w:r>
+      <w:proofErr w:type="gramStart"/>
+      <w:r>
+        <w:rPr>
+          <w:sz w:val="24"/>
+          <w:szCs w:val="24"/>
+        </w:rPr>
+        <w:t>1:{</w:t>
+      </w:r>
+      <w:proofErr w:type="gramEnd"/>
+      <w:r>
+        <w:rPr>
+          <w:sz w:val="24"/>
+          <w:szCs w:val="24"/>
+        </w:rPr>
+        <w:t>audio1:[start_evento1,fine_evento1][start_evento2,end_evento2],audio2:[]…}, classe2:{…}</w:t>
       </w:r>
     </w:p>
     <w:p>
@@ -1743,7 +1858,23 @@
           <w:sz w:val="24"/>
           <w:szCs w:val="24"/>
         </w:rPr>
-        <w:t>, cioè i famosi k-shot=5. Dunque se ipotizzassimo che la classe “Cane” sia presente in 2 audio, il support set sarebbe i primi 5 eventi(se presenti) positivi per ognuno dei due audio. Questo per ognuna delle classi naturalmente.</w:t>
+        <w:t xml:space="preserve">, cioè i famosi k-shot=5. Dunque se ipotizzassimo che la classe “Cane” sia presente in 2 audio, il support set sarebbe i primi 5 </w:t>
+      </w:r>
+      <w:proofErr w:type="gramStart"/>
+      <w:r>
+        <w:rPr>
+          <w:sz w:val="24"/>
+          <w:szCs w:val="24"/>
+        </w:rPr>
+        <w:t>eventi(</w:t>
+      </w:r>
+      <w:proofErr w:type="gramEnd"/>
+      <w:r>
+        <w:rPr>
+          <w:sz w:val="24"/>
+          <w:szCs w:val="24"/>
+        </w:rPr>
+        <w:t>se presenti) positivi per ognuno dei due audio. Questo per ognuna delle classi naturalmente.</w:t>
       </w:r>
     </w:p>
     <w:p>
@@ -1762,6 +1893,7 @@
         <w:t xml:space="preserve">Si noti che su suggerimento del </w:t>
       </w:r>
       <w:proofErr w:type="spellStart"/>
+      <w:proofErr w:type="gramStart"/>
       <w:r>
         <w:rPr>
           <w:sz w:val="24"/>
@@ -1770,6 +1902,7 @@
         <w:t>Dr.Carnemolla</w:t>
       </w:r>
       <w:proofErr w:type="spellEnd"/>
+      <w:proofErr w:type="gramEnd"/>
       <w:r>
         <w:rPr>
           <w:sz w:val="24"/>
@@ -1860,7 +1993,23 @@
           <w:sz w:val="24"/>
           <w:szCs w:val="24"/>
         </w:rPr>
-        <w:t xml:space="preserve">Evitando di discutere dettagli specifici di implementazione(presenti nella funzione </w:t>
+        <w:t xml:space="preserve">Evitando di discutere dettagli specifici di </w:t>
+      </w:r>
+      <w:proofErr w:type="gramStart"/>
+      <w:r>
+        <w:rPr>
+          <w:sz w:val="24"/>
+          <w:szCs w:val="24"/>
+        </w:rPr>
+        <w:t>implementazione(</w:t>
+      </w:r>
+      <w:proofErr w:type="gramEnd"/>
+      <w:r>
+        <w:rPr>
+          <w:sz w:val="24"/>
+          <w:szCs w:val="24"/>
+        </w:rPr>
+        <w:t xml:space="preserve">presenti nella funzione </w:t>
       </w:r>
       <w:proofErr w:type="spellStart"/>
       <w:r>
@@ -1895,6 +2044,7 @@
         <w:t xml:space="preserve">) nel file creazione dati_training.py), la creazione del support set si basa sull’estrazione dei frammenti di audio corrispondenti ai primi 5 eventi positivi presenti nei vari audio, per ognuna delle classi. Tale estrazione è svolta attraverso </w:t>
       </w:r>
       <w:proofErr w:type="spellStart"/>
+      <w:proofErr w:type="gramStart"/>
       <w:r>
         <w:rPr>
           <w:sz w:val="24"/>
@@ -1903,6 +2053,7 @@
         <w:t>librosa.load</w:t>
       </w:r>
       <w:proofErr w:type="spellEnd"/>
+      <w:proofErr w:type="gramEnd"/>
       <w:r>
         <w:rPr>
           <w:sz w:val="24"/>
@@ -1927,6 +2078,7 @@
         <w:t xml:space="preserve">Per la rappresentazione degli eventi su suggerimento del </w:t>
       </w:r>
       <w:proofErr w:type="spellStart"/>
+      <w:proofErr w:type="gramStart"/>
       <w:r>
         <w:rPr>
           <w:sz w:val="24"/>
@@ -1935,6 +2087,7 @@
         <w:t>Dr.Carnemolla</w:t>
       </w:r>
       <w:proofErr w:type="spellEnd"/>
+      <w:proofErr w:type="gramEnd"/>
       <w:r>
         <w:rPr>
           <w:sz w:val="24"/>
@@ -2151,7 +2304,15 @@
           <w:sz w:val="24"/>
           <w:szCs w:val="24"/>
         </w:rPr>
-        <w:t>(set) )</w:t>
+        <w:t>(set</w:t>
+      </w:r>
+      <w:proofErr w:type="gramStart"/>
+      <w:r>
+        <w:rPr>
+          <w:sz w:val="24"/>
+          <w:szCs w:val="24"/>
+        </w:rPr>
+        <w:t>) )</w:t>
       </w:r>
       <w:r>
         <w:rPr>
@@ -2165,7 +2326,15 @@
           <w:sz w:val="24"/>
           <w:szCs w:val="24"/>
         </w:rPr>
-        <w:t xml:space="preserve">Nello specifico essendovi alcune classi con </w:t>
+        <w:t>Nello</w:t>
+      </w:r>
+      <w:proofErr w:type="gramEnd"/>
+      <w:r>
+        <w:rPr>
+          <w:sz w:val="24"/>
+          <w:szCs w:val="24"/>
+        </w:rPr>
+        <w:t xml:space="preserve"> specifico essendovi alcune classi con </w:t>
       </w:r>
       <w:r>
         <w:rPr>
@@ -2707,16 +2876,7 @@
           <w:sz w:val="30"/>
           <w:szCs w:val="30"/>
         </w:rPr>
-        <w:t>Eventi di durata variabile</w:t>
-      </w:r>
-      <w:r>
-        <w:rPr>
-          <w:b/>
-          <w:bCs/>
-          <w:sz w:val="30"/>
-          <w:szCs w:val="30"/>
-        </w:rPr>
-        <w:t>:</w:t>
+        <w:t>Eventi di durata variabile:</w:t>
       </w:r>
       <w:r>
         <w:rPr>
@@ -3193,6 +3353,46 @@
     </w:p>
     <w:p>
       <w:pPr>
+        <w:shd w:val="clear" w:color="auto" w:fill="FFFFFF"/>
+        <w:spacing w:after="0" w:line="240" w:lineRule="auto"/>
+        <w:jc w:val="both"/>
+        <w:textAlignment w:val="baseline"/>
+        <w:rPr>
+          <w:rFonts w:ascii="Calibri" w:eastAsia="Times New Roman" w:hAnsi="Calibri" w:cs="Calibri"/>
+          <w:color w:val="000000"/>
+          <w:sz w:val="24"/>
+          <w:szCs w:val="24"/>
+          <w:lang w:eastAsia="it-IT"/>
+        </w:rPr>
+      </w:pPr>
+    </w:p>
+    <w:p>
+      <w:pPr>
+        <w:shd w:val="clear" w:color="auto" w:fill="FFFFFF"/>
+        <w:spacing w:after="0" w:line="240" w:lineRule="auto"/>
+        <w:jc w:val="both"/>
+        <w:textAlignment w:val="baseline"/>
+        <w:rPr>
+          <w:rFonts w:ascii="Calibri" w:eastAsia="Times New Roman" w:hAnsi="Calibri" w:cs="Calibri"/>
+          <w:color w:val="000000"/>
+          <w:sz w:val="24"/>
+          <w:szCs w:val="24"/>
+          <w:lang w:eastAsia="it-IT"/>
+        </w:rPr>
+      </w:pPr>
+      <w:r>
+        <w:rPr>
+          <w:rFonts w:ascii="Calibri" w:eastAsia="Times New Roman" w:hAnsi="Calibri" w:cs="Calibri"/>
+          <w:color w:val="000000"/>
+          <w:sz w:val="24"/>
+          <w:szCs w:val="24"/>
+          <w:lang w:eastAsia="it-IT"/>
+        </w:rPr>
+        <w:t>P.S: Potrebbe essere una buona idea utilizzare GAN per creare i dati aggiuntivi necessari a pareggiare il dataset?</w:t>
+      </w:r>
+    </w:p>
+    <w:p>
+      <w:pPr>
         <w:rPr>
           <w:b/>
           <w:bCs/>
@@ -3254,7 +3454,15 @@
           <w:sz w:val="24"/>
           <w:szCs w:val="24"/>
         </w:rPr>
-        <w:t xml:space="preserve">L’algoritmo di creazione del support set dal punto di vista pratico crea un tensore di  </w:t>
+        <w:t xml:space="preserve">L’algoritmo di creazione del support set dal punto di vista pratico crea un tensore </w:t>
+      </w:r>
+      <w:proofErr w:type="gramStart"/>
+      <w:r>
+        <w:rPr>
+          <w:sz w:val="24"/>
+          <w:szCs w:val="24"/>
+        </w:rPr>
+        <w:t xml:space="preserve">di  </w:t>
       </w:r>
       <w:proofErr w:type="spellStart"/>
       <w:r>
@@ -3265,6 +3473,7 @@
         <w:t>Shape</w:t>
       </w:r>
       <w:proofErr w:type="spellEnd"/>
+      <w:proofErr w:type="gramEnd"/>
       <w:r>
         <w:rPr>
           <w:sz w:val="24"/>
@@ -3310,6 +3519,7 @@
         <w:t xml:space="preserve">. Dal punto di vista pratico tale tensore è di </w:t>
       </w:r>
       <w:proofErr w:type="spellStart"/>
+      <w:proofErr w:type="gramStart"/>
       <w:r>
         <w:rPr>
           <w:sz w:val="24"/>
@@ -3323,7 +3533,15 @@
           <w:sz w:val="24"/>
           <w:szCs w:val="24"/>
         </w:rPr>
-        <w:t xml:space="preserve">(21,25,401,220). Il 220 è dato dal sampling rate=22050* </w:t>
+        <w:t>(</w:t>
+      </w:r>
+      <w:proofErr w:type="gramEnd"/>
+      <w:r>
+        <w:rPr>
+          <w:sz w:val="24"/>
+          <w:szCs w:val="24"/>
+        </w:rPr>
+        <w:t xml:space="preserve">21,25,401,220). Il 220 è dato dal sampling rate=22050* </w:t>
       </w:r>
       <w:proofErr w:type="spellStart"/>
       <w:r>
@@ -3372,6 +3590,77 @@
           <w:szCs w:val="24"/>
         </w:rPr>
         <w:t>).</w:t>
+      </w:r>
+    </w:p>
+    <w:p>
+      <w:pPr>
+        <w:jc w:val="both"/>
+        <w:rPr>
+          <w:sz w:val="24"/>
+          <w:szCs w:val="24"/>
+        </w:rPr>
+      </w:pPr>
+    </w:p>
+    <w:p>
+      <w:pPr>
+        <w:jc w:val="both"/>
+        <w:rPr>
+          <w:sz w:val="24"/>
+          <w:szCs w:val="24"/>
+        </w:rPr>
+      </w:pPr>
+      <w:r>
+        <w:rPr>
+          <w:sz w:val="24"/>
+          <w:szCs w:val="24"/>
+        </w:rPr>
+        <w:t>P.S: Il team dell’a</w:t>
+      </w:r>
+      <w:r>
+        <w:rPr>
+          <w:sz w:val="24"/>
+          <w:szCs w:val="24"/>
+        </w:rPr>
+        <w:t xml:space="preserve">nno scorso usava gli eventi di supporto per creare il </w:t>
+      </w:r>
+      <w:proofErr w:type="spellStart"/>
+      <w:r>
+        <w:rPr>
+          <w:sz w:val="24"/>
+          <w:szCs w:val="24"/>
+        </w:rPr>
+        <w:t>latent</w:t>
+      </w:r>
+      <w:proofErr w:type="spellEnd"/>
+      <w:r>
+        <w:rPr>
+          <w:sz w:val="24"/>
+          <w:szCs w:val="24"/>
+        </w:rPr>
+        <w:t xml:space="preserve"> </w:t>
+      </w:r>
+      <w:proofErr w:type="spellStart"/>
+      <w:r>
+        <w:rPr>
+          <w:sz w:val="24"/>
+          <w:szCs w:val="24"/>
+        </w:rPr>
+        <w:t>space</w:t>
+      </w:r>
+      <w:proofErr w:type="spellEnd"/>
+      <w:r>
+        <w:rPr>
+          <w:sz w:val="24"/>
+          <w:szCs w:val="24"/>
+        </w:rPr>
+        <w:t xml:space="preserve"> e faceva ciò massimizzando la differenza di rappresentazione fra eventi e audio precedente a tali eventi. Qui non ho salvato tali intermezzi negativi. </w:t>
+      </w:r>
+      <w:r>
+        <w:rPr>
+          <w:sz w:val="24"/>
+          <w:szCs w:val="24"/>
+        </w:rPr>
+        <w:t>In teoria pensavo di creare un altro modello che facesse tale operazione e usarlo in combinazione ad un modello che usa i dati in questo modo, tuttavia quando mi sono documentato ho scoperto che è la definizione di ensemble learning, tecnica proibita per la challenge.</w:t>
       </w:r>
     </w:p>
     <w:p>
@@ -3400,7 +3689,6 @@
           <w:sz w:val="40"/>
           <w:szCs w:val="40"/>
         </w:rPr>
-        <w:lastRenderedPageBreak/>
         <w:t>Creazione Query set</w:t>
       </w:r>
     </w:p>
@@ -3509,7 +3797,44 @@
           <w:sz w:val="24"/>
           <w:szCs w:val="24"/>
         </w:rPr>
-        <w:t xml:space="preserve"> è che gli eventi non sono più tutto l’audio che carichiamo, bensì solo una porzione dell’audio. Pertanto a livello implementativo è necessario capire come gestire la seconda dimensione del tensore. Per il support set tale dimensione rappresentava l’evento riferito alla classe, qui serve trovare un’altra soluzione. A tal proposito ho pensato alle seguenti proposte:</w:t>
+        <w:t xml:space="preserve"> è che gli eventi non sono più tutto l’audio che carichiamo, bensì solo una porzione dell’audio. Pertanto a livello implementativo è necessario capire come gestire la seconda dimensione del tensore. Per il support set tale dimensione rappresentava l’evento riferito alla classe, qui serve trovare un’altra soluzione. A tal proposito ho pensato </w:t>
+      </w:r>
+      <w:proofErr w:type="gramStart"/>
+      <w:r>
+        <w:rPr>
+          <w:sz w:val="24"/>
+          <w:szCs w:val="24"/>
+        </w:rPr>
+        <w:t>alle seguent</w:t>
+      </w:r>
+      <w:r>
+        <w:rPr>
+          <w:sz w:val="24"/>
+          <w:szCs w:val="24"/>
+        </w:rPr>
+        <w:t>e</w:t>
+      </w:r>
+      <w:proofErr w:type="gramEnd"/>
+      <w:r>
+        <w:rPr>
+          <w:sz w:val="24"/>
+          <w:szCs w:val="24"/>
+        </w:rPr>
+        <w:t xml:space="preserve"> propost</w:t>
+      </w:r>
+      <w:r>
+        <w:rPr>
+          <w:sz w:val="24"/>
+          <w:szCs w:val="24"/>
+        </w:rPr>
+        <w:t>a</w:t>
+      </w:r>
+      <w:r>
+        <w:rPr>
+          <w:sz w:val="24"/>
+          <w:szCs w:val="24"/>
+        </w:rPr>
+        <w:t>:</w:t>
       </w:r>
     </w:p>
     <w:p>
@@ -3611,6 +3936,7 @@
         <w:t xml:space="preserve"> Di conseguenza avremo la label come tensore 3d di </w:t>
       </w:r>
       <w:proofErr w:type="spellStart"/>
+      <w:proofErr w:type="gramStart"/>
       <w:r>
         <w:rPr>
           <w:sz w:val="24"/>
@@ -3627,6 +3953,7 @@
         <w:t>(</w:t>
       </w:r>
       <w:proofErr w:type="spellStart"/>
+      <w:proofErr w:type="gramEnd"/>
       <w:r>
         <w:rPr>
           <w:sz w:val="24"/>
@@ -3682,6 +4009,7 @@
         <w:t xml:space="preserve">, essendo non tanto il numero di eventi dopo il quinto positivi, ma il numero di </w:t>
       </w:r>
       <w:proofErr w:type="spellStart"/>
+      <w:proofErr w:type="gramStart"/>
       <w:r>
         <w:rPr>
           <w:sz w:val="24"/>
@@ -3695,7 +4023,15 @@
           <w:sz w:val="24"/>
           <w:szCs w:val="24"/>
         </w:rPr>
-        <w:t xml:space="preserve">(di durata temporale pari all’evento max) presenti nell’audio. A questo punto però si </w:t>
+        <w:t>(</w:t>
+      </w:r>
+      <w:proofErr w:type="gramEnd"/>
+      <w:r>
+        <w:rPr>
+          <w:sz w:val="24"/>
+          <w:szCs w:val="24"/>
+        </w:rPr>
+        <w:t xml:space="preserve">di durata temporale pari all’evento max) presenti nell’audio. A questo punto però si </w:t>
       </w:r>
       <w:proofErr w:type="spellStart"/>
       <w:r>
@@ -3711,21 +4047,7 @@
           <w:sz w:val="24"/>
           <w:szCs w:val="24"/>
         </w:rPr>
-        <w:t xml:space="preserve"> una nuova variabilità, quella a livello di audio. Difatti tramite funzione presente nel codice si ricava che l’audio più lungo è di 7200s cioè 3h e il più breve di 600s, cioè circa 10m. La media di durata degli audio è di 5800s cioè 96m </w:t>
-      </w:r>
-      <w:r>
-        <w:rPr>
-          <w:sz w:val="24"/>
-          <w:szCs w:val="24"/>
-        </w:rPr>
-        <w:t>circa</w:t>
-      </w:r>
-      <w:r>
-        <w:rPr>
-          <w:sz w:val="24"/>
-          <w:szCs w:val="24"/>
-        </w:rPr>
-        <w:t xml:space="preserve">. A questo punto si possono introdurre varie </w:t>
+        <w:t xml:space="preserve"> una nuova variabilità, quella a livello di audio. Difatti tramite funzione presente nel codice si ricava che l’audio più lungo è di 7200s cioè 3h e il più breve di 600s, cioè circa 10m. La media di durata degli audio è di 5800s cioè 96m circa. A questo punto si possono introdurre varie </w:t>
       </w:r>
       <w:proofErr w:type="spellStart"/>
       <w:r>
@@ -3820,54 +4142,1691 @@
     </w:p>
     <w:p>
       <w:pPr>
-        <w:jc w:val="both"/>
-        <w:rPr>
-          <w:sz w:val="24"/>
-          <w:szCs w:val="24"/>
-        </w:rPr>
-      </w:pPr>
-    </w:p>
-    <w:p>
-      <w:pPr>
-        <w:jc w:val="both"/>
-        <w:rPr>
-          <w:sz w:val="24"/>
-          <w:szCs w:val="24"/>
-        </w:rPr>
-      </w:pPr>
-    </w:p>
-    <w:p>
-      <w:pPr>
-        <w:jc w:val="both"/>
-        <w:rPr>
-          <w:sz w:val="24"/>
-          <w:szCs w:val="24"/>
-        </w:rPr>
-      </w:pPr>
-    </w:p>
-    <w:p>
-      <w:pPr>
-        <w:jc w:val="both"/>
-        <w:rPr>
-          <w:sz w:val="24"/>
-          <w:szCs w:val="24"/>
-        </w:rPr>
-      </w:pPr>
-      <w:r>
+        <w:pStyle w:val="Paragrafoelenco"/>
+        <w:numPr>
+          <w:ilvl w:val="0"/>
+          <w:numId w:val="14"/>
+        </w:numPr>
+        <w:jc w:val="both"/>
+        <w:rPr>
+          <w:sz w:val="24"/>
+          <w:szCs w:val="24"/>
+        </w:rPr>
+      </w:pPr>
+      <w:r>
+        <w:rPr>
+          <w:sz w:val="24"/>
+          <w:szCs w:val="24"/>
+        </w:rPr>
+        <w:t xml:space="preserve">Renderli pari alla durata media, tagliando gli audio più lunghi della soglia e </w:t>
+      </w:r>
+      <w:proofErr w:type="spellStart"/>
+      <w:r>
+        <w:rPr>
+          <w:sz w:val="24"/>
+          <w:szCs w:val="24"/>
+        </w:rPr>
+        <w:t>augmentando</w:t>
+      </w:r>
+      <w:proofErr w:type="spellEnd"/>
+      <w:r>
+        <w:rPr>
+          <w:sz w:val="24"/>
+          <w:szCs w:val="24"/>
+        </w:rPr>
+        <w:t xml:space="preserve"> gli audio sottosoglia.</w:t>
+      </w:r>
+    </w:p>
+    <w:p>
+      <w:pPr>
+        <w:jc w:val="center"/>
+        <w:rPr>
+          <w:sz w:val="24"/>
+          <w:szCs w:val="24"/>
+        </w:rPr>
+      </w:pPr>
+    </w:p>
+    <w:p>
+      <w:pPr>
+        <w:jc w:val="center"/>
+        <w:rPr>
+          <w:sz w:val="24"/>
+          <w:szCs w:val="24"/>
+        </w:rPr>
+      </w:pPr>
+    </w:p>
+    <w:p>
+      <w:pPr>
+        <w:jc w:val="center"/>
+        <w:rPr>
+          <w:sz w:val="24"/>
+          <w:szCs w:val="24"/>
+        </w:rPr>
+      </w:pPr>
+    </w:p>
+    <w:p>
+      <w:pPr>
+        <w:jc w:val="center"/>
         <w:rPr>
           <w:b/>
           <w:bCs/>
-          <w:sz w:val="24"/>
-          <w:szCs w:val="24"/>
-        </w:rPr>
-        <w:t>CNN14</w:t>
-      </w:r>
-      <w:r>
-        <w:rPr>
-          <w:sz w:val="24"/>
-          <w:szCs w:val="24"/>
-        </w:rPr>
-        <w:t xml:space="preserve">:Rete </w:t>
+          <w:sz w:val="30"/>
+          <w:szCs w:val="30"/>
+          <w:lang w:val="en-US"/>
+        </w:rPr>
+      </w:pPr>
+      <w:proofErr w:type="spellStart"/>
+      <w:r>
+        <w:rPr>
+          <w:b/>
+          <w:bCs/>
+          <w:sz w:val="30"/>
+          <w:szCs w:val="30"/>
+          <w:lang w:val="en-US"/>
+        </w:rPr>
+        <w:t>Stato</w:t>
+      </w:r>
+      <w:proofErr w:type="spellEnd"/>
+      <w:r>
+        <w:rPr>
+          <w:b/>
+          <w:bCs/>
+          <w:sz w:val="30"/>
+          <w:szCs w:val="30"/>
+          <w:lang w:val="en-US"/>
+        </w:rPr>
+        <w:t xml:space="preserve"> dell’arte Few Shot Learning Audio</w:t>
+      </w:r>
+    </w:p>
+    <w:p>
+      <w:pPr>
+        <w:jc w:val="both"/>
+        <w:rPr>
+          <w:sz w:val="24"/>
+          <w:szCs w:val="24"/>
+        </w:rPr>
+      </w:pPr>
+      <w:r>
+        <w:rPr>
+          <w:sz w:val="24"/>
+          <w:szCs w:val="24"/>
+        </w:rPr>
+        <w:t xml:space="preserve">Lo stato dell’arte del </w:t>
+      </w:r>
+      <w:proofErr w:type="spellStart"/>
+      <w:r>
+        <w:rPr>
+          <w:sz w:val="24"/>
+          <w:szCs w:val="24"/>
+        </w:rPr>
+        <w:t>Few</w:t>
+      </w:r>
+      <w:proofErr w:type="spellEnd"/>
+      <w:r>
+        <w:rPr>
+          <w:sz w:val="24"/>
+          <w:szCs w:val="24"/>
+        </w:rPr>
+        <w:t xml:space="preserve"> Shot learning si basa su due diversi tipi di approcci, i </w:t>
+      </w:r>
+      <w:proofErr w:type="spellStart"/>
+      <w:r>
+        <w:rPr>
+          <w:sz w:val="24"/>
+          <w:szCs w:val="24"/>
+        </w:rPr>
+        <w:t>metric</w:t>
+      </w:r>
+      <w:proofErr w:type="spellEnd"/>
+      <w:r>
+        <w:rPr>
+          <w:sz w:val="24"/>
+          <w:szCs w:val="24"/>
+        </w:rPr>
+        <w:t xml:space="preserve"> based </w:t>
+      </w:r>
+      <w:proofErr w:type="spellStart"/>
+      <w:r>
+        <w:rPr>
+          <w:sz w:val="24"/>
+          <w:szCs w:val="24"/>
+        </w:rPr>
+        <w:t>approaches</w:t>
+      </w:r>
+      <w:proofErr w:type="spellEnd"/>
+      <w:r>
+        <w:rPr>
+          <w:sz w:val="24"/>
+          <w:szCs w:val="24"/>
+        </w:rPr>
+        <w:t xml:space="preserve"> e i model based </w:t>
+      </w:r>
+      <w:proofErr w:type="spellStart"/>
+      <w:proofErr w:type="gramStart"/>
+      <w:r>
+        <w:rPr>
+          <w:sz w:val="24"/>
+          <w:szCs w:val="24"/>
+        </w:rPr>
+        <w:t>approaches</w:t>
+      </w:r>
+      <w:proofErr w:type="spellEnd"/>
+      <w:r>
+        <w:rPr>
+          <w:sz w:val="24"/>
+          <w:szCs w:val="24"/>
+        </w:rPr>
+        <w:t>( tra</w:t>
+      </w:r>
+      <w:proofErr w:type="gramEnd"/>
+      <w:r>
+        <w:rPr>
+          <w:sz w:val="24"/>
+          <w:szCs w:val="24"/>
+        </w:rPr>
+        <w:t xml:space="preserve"> i model based vi sono le </w:t>
+      </w:r>
+      <w:proofErr w:type="spellStart"/>
+      <w:r>
+        <w:rPr>
+          <w:sz w:val="24"/>
+          <w:szCs w:val="24"/>
+        </w:rPr>
+        <w:t>memory-augmented</w:t>
+      </w:r>
+      <w:proofErr w:type="spellEnd"/>
+      <w:r>
+        <w:rPr>
+          <w:sz w:val="24"/>
+          <w:szCs w:val="24"/>
+        </w:rPr>
+        <w:t xml:space="preserve"> network, meta-learning e </w:t>
+      </w:r>
+      <w:proofErr w:type="spellStart"/>
+      <w:r>
+        <w:rPr>
+          <w:sz w:val="24"/>
+          <w:szCs w:val="24"/>
+        </w:rPr>
+        <w:t>Gradient</w:t>
+      </w:r>
+      <w:proofErr w:type="spellEnd"/>
+      <w:r>
+        <w:rPr>
+          <w:sz w:val="24"/>
+          <w:szCs w:val="24"/>
+        </w:rPr>
+        <w:t>-Based Meta Learning)</w:t>
+      </w:r>
+      <w:r>
+        <w:rPr>
+          <w:sz w:val="24"/>
+          <w:szCs w:val="24"/>
+        </w:rPr>
+        <w:t>.</w:t>
+      </w:r>
+    </w:p>
+    <w:p>
+      <w:pPr>
+        <w:jc w:val="both"/>
+        <w:rPr>
+          <w:sz w:val="24"/>
+          <w:szCs w:val="24"/>
+        </w:rPr>
+      </w:pPr>
+      <w:r>
+        <w:rPr>
+          <w:sz w:val="24"/>
+          <w:szCs w:val="24"/>
+        </w:rPr>
+        <w:t xml:space="preserve">Tra i </w:t>
+      </w:r>
+      <w:proofErr w:type="spellStart"/>
+      <w:r>
+        <w:rPr>
+          <w:sz w:val="24"/>
+          <w:szCs w:val="24"/>
+        </w:rPr>
+        <w:t>metric</w:t>
+      </w:r>
+      <w:proofErr w:type="spellEnd"/>
+      <w:r>
+        <w:rPr>
+          <w:sz w:val="24"/>
+          <w:szCs w:val="24"/>
+        </w:rPr>
+        <w:t xml:space="preserve"> based vi sono:</w:t>
+      </w:r>
+    </w:p>
+    <w:p>
+      <w:pPr>
+        <w:pStyle w:val="Paragrafoelenco"/>
+        <w:numPr>
+          <w:ilvl w:val="0"/>
+          <w:numId w:val="15"/>
+        </w:numPr>
+        <w:jc w:val="both"/>
+        <w:rPr>
+          <w:sz w:val="24"/>
+          <w:szCs w:val="24"/>
+        </w:rPr>
+      </w:pPr>
+      <w:r>
+        <w:rPr>
+          <w:sz w:val="24"/>
+          <w:szCs w:val="24"/>
+        </w:rPr>
+        <w:t xml:space="preserve">Siamese Network: Imparano a creare rappresentazioni degli input samples e usano metriche di distanza (ad esempio euclidea) per comparare la </w:t>
+      </w:r>
+      <w:proofErr w:type="spellStart"/>
+      <w:proofErr w:type="gramStart"/>
+      <w:r>
+        <w:rPr>
+          <w:sz w:val="24"/>
+          <w:szCs w:val="24"/>
+        </w:rPr>
+        <w:t>similiarità</w:t>
+      </w:r>
+      <w:proofErr w:type="spellEnd"/>
+      <w:r>
+        <w:rPr>
+          <w:sz w:val="24"/>
+          <w:szCs w:val="24"/>
+        </w:rPr>
+        <w:t xml:space="preserve">  tra</w:t>
+      </w:r>
+      <w:proofErr w:type="gramEnd"/>
+      <w:r>
+        <w:rPr>
+          <w:sz w:val="24"/>
+          <w:szCs w:val="24"/>
+        </w:rPr>
+        <w:t xml:space="preserve"> eventi di una stessa classe e eventi di un’altra classe/ eventi negativi. Serve un support set con </w:t>
+      </w:r>
+      <w:proofErr w:type="spellStart"/>
+      <w:r>
+        <w:rPr>
+          <w:sz w:val="24"/>
+          <w:szCs w:val="24"/>
+        </w:rPr>
+        <w:t>labeled</w:t>
+      </w:r>
+      <w:proofErr w:type="spellEnd"/>
+      <w:r>
+        <w:rPr>
+          <w:sz w:val="24"/>
+          <w:szCs w:val="24"/>
+        </w:rPr>
+        <w:t xml:space="preserve"> </w:t>
+      </w:r>
+      <w:proofErr w:type="spellStart"/>
+      <w:r>
+        <w:rPr>
+          <w:sz w:val="24"/>
+          <w:szCs w:val="24"/>
+        </w:rPr>
+        <w:t>examples</w:t>
+      </w:r>
+      <w:proofErr w:type="spellEnd"/>
+      <w:r>
+        <w:rPr>
+          <w:sz w:val="24"/>
+          <w:szCs w:val="24"/>
+        </w:rPr>
+        <w:t xml:space="preserve"> e il query che deve avere esempi da classificare.</w:t>
+      </w:r>
+    </w:p>
+    <w:p>
+      <w:pPr>
+        <w:pStyle w:val="Paragrafoelenco"/>
+        <w:numPr>
+          <w:ilvl w:val="0"/>
+          <w:numId w:val="15"/>
+        </w:numPr>
+        <w:jc w:val="both"/>
+        <w:rPr>
+          <w:sz w:val="24"/>
+          <w:szCs w:val="24"/>
+        </w:rPr>
+      </w:pPr>
+      <w:proofErr w:type="spellStart"/>
+      <w:r>
+        <w:rPr>
+          <w:sz w:val="24"/>
+          <w:szCs w:val="24"/>
+        </w:rPr>
+        <w:t>Prototypical</w:t>
+      </w:r>
+      <w:proofErr w:type="spellEnd"/>
+      <w:r>
+        <w:rPr>
+          <w:sz w:val="24"/>
+          <w:szCs w:val="24"/>
+        </w:rPr>
+        <w:t xml:space="preserve"> Network: Si crea un prototipo per ogni classe, creato dalla media delle rappresentazioni per i vari esempi </w:t>
+      </w:r>
+      <w:proofErr w:type="spellStart"/>
+      <w:r>
+        <w:rPr>
+          <w:sz w:val="24"/>
+          <w:szCs w:val="24"/>
+        </w:rPr>
+        <w:t>few</w:t>
+      </w:r>
+      <w:proofErr w:type="spellEnd"/>
+      <w:r>
+        <w:rPr>
+          <w:sz w:val="24"/>
+          <w:szCs w:val="24"/>
+        </w:rPr>
+        <w:t xml:space="preserve">-shots (nel nostro caso 5). Poi si comparano i query samples ai prototipi per determinare la loro classe. Si compara la vicinanza del query </w:t>
+      </w:r>
+      <w:proofErr w:type="spellStart"/>
+      <w:r>
+        <w:rPr>
+          <w:sz w:val="24"/>
+          <w:szCs w:val="24"/>
+        </w:rPr>
+        <w:t>examples</w:t>
+      </w:r>
+      <w:proofErr w:type="spellEnd"/>
+      <w:r>
+        <w:rPr>
+          <w:sz w:val="24"/>
+          <w:szCs w:val="24"/>
+        </w:rPr>
+        <w:t xml:space="preserve"> con i </w:t>
+      </w:r>
+      <w:proofErr w:type="gramStart"/>
+      <w:r>
+        <w:rPr>
+          <w:sz w:val="24"/>
+          <w:szCs w:val="24"/>
+        </w:rPr>
+        <w:t>prototipi(</w:t>
+      </w:r>
+      <w:proofErr w:type="gramEnd"/>
+      <w:r>
+        <w:rPr>
+          <w:sz w:val="24"/>
+          <w:szCs w:val="24"/>
+        </w:rPr>
+        <w:t xml:space="preserve">di solito vettori) delle varie classi. Rete molto efficiente </w:t>
+      </w:r>
+      <w:proofErr w:type="spellStart"/>
+      <w:r>
+        <w:rPr>
+          <w:sz w:val="24"/>
+          <w:szCs w:val="24"/>
+        </w:rPr>
+        <w:t>computazionalmente</w:t>
+      </w:r>
+      <w:proofErr w:type="spellEnd"/>
+      <w:r>
+        <w:rPr>
+          <w:sz w:val="24"/>
+          <w:szCs w:val="24"/>
+        </w:rPr>
+        <w:t xml:space="preserve"> e non richiede </w:t>
+      </w:r>
+      <w:r>
+        <w:rPr>
+          <w:sz w:val="24"/>
+          <w:szCs w:val="24"/>
+        </w:rPr>
+        <w:t xml:space="preserve">strategie di meta-learning complesse. Molto usati per </w:t>
+      </w:r>
+      <w:proofErr w:type="spellStart"/>
+      <w:r>
+        <w:rPr>
+          <w:sz w:val="24"/>
+          <w:szCs w:val="24"/>
+        </w:rPr>
+        <w:t>natural</w:t>
+      </w:r>
+      <w:proofErr w:type="spellEnd"/>
+      <w:r>
+        <w:rPr>
+          <w:sz w:val="24"/>
+          <w:szCs w:val="24"/>
+        </w:rPr>
+        <w:t xml:space="preserve"> </w:t>
+      </w:r>
+      <w:proofErr w:type="spellStart"/>
+      <w:r>
+        <w:rPr>
+          <w:sz w:val="24"/>
+          <w:szCs w:val="24"/>
+        </w:rPr>
+        <w:t>language</w:t>
+      </w:r>
+      <w:proofErr w:type="spellEnd"/>
+      <w:r>
+        <w:rPr>
+          <w:sz w:val="24"/>
+          <w:szCs w:val="24"/>
+        </w:rPr>
+        <w:t xml:space="preserve"> processing</w:t>
+      </w:r>
+      <w:r>
+        <w:rPr>
+          <w:sz w:val="24"/>
+          <w:szCs w:val="24"/>
+        </w:rPr>
+        <w:t>.</w:t>
+      </w:r>
+      <w:r>
+        <w:rPr>
+          <w:sz w:val="24"/>
+          <w:szCs w:val="24"/>
+        </w:rPr>
+        <w:t xml:space="preserve"> (è meta-learning).</w:t>
+      </w:r>
+    </w:p>
+    <w:p>
+      <w:pPr>
+        <w:ind w:left="420"/>
+        <w:jc w:val="both"/>
+        <w:rPr>
+          <w:sz w:val="24"/>
+          <w:szCs w:val="24"/>
+        </w:rPr>
+      </w:pPr>
+    </w:p>
+    <w:p>
+      <w:pPr>
+        <w:jc w:val="center"/>
+        <w:rPr>
+          <w:b/>
+          <w:bCs/>
+          <w:sz w:val="30"/>
+          <w:szCs w:val="30"/>
+        </w:rPr>
+      </w:pPr>
+      <w:r>
+        <w:rPr>
+          <w:b/>
+          <w:bCs/>
+          <w:sz w:val="30"/>
+          <w:szCs w:val="30"/>
+        </w:rPr>
+        <w:t>Tecniche di addestramento</w:t>
+      </w:r>
+    </w:p>
+    <w:p>
+      <w:pPr>
+        <w:jc w:val="both"/>
+        <w:rPr>
+          <w:sz w:val="24"/>
+          <w:szCs w:val="24"/>
+        </w:rPr>
+      </w:pPr>
+      <w:r>
+        <w:rPr>
+          <w:sz w:val="24"/>
+          <w:szCs w:val="24"/>
+        </w:rPr>
+        <w:t xml:space="preserve">Va però fatta una scelta, se utilizzare modelli </w:t>
+      </w:r>
+      <w:proofErr w:type="spellStart"/>
+      <w:r>
+        <w:rPr>
+          <w:sz w:val="24"/>
+          <w:szCs w:val="24"/>
+        </w:rPr>
+        <w:t>pre-addrestrati</w:t>
+      </w:r>
+      <w:proofErr w:type="spellEnd"/>
+      <w:r>
+        <w:rPr>
+          <w:sz w:val="24"/>
+          <w:szCs w:val="24"/>
+        </w:rPr>
+        <w:t xml:space="preserve"> su grandi dataset e fare il fine tuning con il support set.</w:t>
+      </w:r>
+      <w:r>
+        <w:rPr>
+          <w:sz w:val="24"/>
+          <w:szCs w:val="24"/>
+        </w:rPr>
+        <w:t xml:space="preserve"> Cioè aggiungere ad un modello già presente e addestrato un </w:t>
+      </w:r>
+      <w:proofErr w:type="spellStart"/>
+      <w:r>
+        <w:rPr>
+          <w:sz w:val="24"/>
+          <w:szCs w:val="24"/>
+        </w:rPr>
+        <w:t>layer</w:t>
+      </w:r>
+      <w:proofErr w:type="spellEnd"/>
+      <w:r>
+        <w:rPr>
+          <w:sz w:val="24"/>
+          <w:szCs w:val="24"/>
+        </w:rPr>
+        <w:t xml:space="preserve"> aggiuntivo di classificazione con le nostre 21 classi. Secondo me andrebbe fatto.</w:t>
+      </w:r>
+    </w:p>
+    <w:p>
+      <w:pPr>
+        <w:jc w:val="both"/>
+        <w:rPr>
+          <w:sz w:val="24"/>
+          <w:szCs w:val="24"/>
+        </w:rPr>
+      </w:pPr>
+      <w:r>
+        <w:rPr>
+          <w:sz w:val="24"/>
+          <w:szCs w:val="24"/>
+        </w:rPr>
+        <w:t xml:space="preserve">Usando una </w:t>
+      </w:r>
+      <w:proofErr w:type="spellStart"/>
+      <w:r>
+        <w:rPr>
+          <w:sz w:val="24"/>
+          <w:szCs w:val="24"/>
+        </w:rPr>
+        <w:t>prototypica</w:t>
+      </w:r>
+      <w:proofErr w:type="spellEnd"/>
+      <w:r>
+        <w:rPr>
+          <w:sz w:val="24"/>
+          <w:szCs w:val="24"/>
+        </w:rPr>
+        <w:t xml:space="preserve"> network, d</w:t>
+      </w:r>
+      <w:r>
+        <w:rPr>
+          <w:sz w:val="24"/>
+          <w:szCs w:val="24"/>
+        </w:rPr>
+        <w:t>urante l</w:t>
+      </w:r>
+      <w:r>
+        <w:rPr>
+          <w:sz w:val="24"/>
+          <w:szCs w:val="24"/>
+        </w:rPr>
+        <w:t>’</w:t>
+      </w:r>
+      <w:r>
+        <w:rPr>
+          <w:sz w:val="24"/>
+          <w:szCs w:val="24"/>
+        </w:rPr>
+        <w:t>addestramento</w:t>
+      </w:r>
+      <w:r>
+        <w:rPr>
+          <w:sz w:val="24"/>
+          <w:szCs w:val="24"/>
+        </w:rPr>
+        <w:t xml:space="preserve"> dobbiamo</w:t>
+      </w:r>
+      <w:r>
+        <w:rPr>
+          <w:sz w:val="24"/>
+          <w:szCs w:val="24"/>
+        </w:rPr>
+        <w:t xml:space="preserve"> minimizza</w:t>
+      </w:r>
+      <w:r>
+        <w:rPr>
+          <w:sz w:val="24"/>
+          <w:szCs w:val="24"/>
+        </w:rPr>
+        <w:t>re</w:t>
+      </w:r>
+      <w:r>
+        <w:rPr>
+          <w:sz w:val="24"/>
+          <w:szCs w:val="24"/>
+        </w:rPr>
+        <w:t xml:space="preserve"> una funzione di perdita basata sulla distanza tra le </w:t>
+      </w:r>
+      <w:proofErr w:type="spellStart"/>
+      <w:r>
+        <w:rPr>
+          <w:sz w:val="24"/>
+          <w:szCs w:val="24"/>
+        </w:rPr>
+        <w:t>embedding</w:t>
+      </w:r>
+      <w:proofErr w:type="spellEnd"/>
+      <w:r>
+        <w:rPr>
+          <w:sz w:val="24"/>
+          <w:szCs w:val="24"/>
+        </w:rPr>
+        <w:t xml:space="preserve"> degli esempi di query e i prototipi delle loro classi vere. Una comune funzione di perdita è la Cross-</w:t>
+      </w:r>
+      <w:proofErr w:type="spellStart"/>
+      <w:r>
+        <w:rPr>
+          <w:sz w:val="24"/>
+          <w:szCs w:val="24"/>
+        </w:rPr>
+        <w:t>Entropy</w:t>
+      </w:r>
+      <w:proofErr w:type="spellEnd"/>
+      <w:r>
+        <w:rPr>
+          <w:sz w:val="24"/>
+          <w:szCs w:val="24"/>
+        </w:rPr>
+        <w:t xml:space="preserve"> Loss applicata sulle distanze calcolate, utilizzando un </w:t>
+      </w:r>
+      <w:proofErr w:type="spellStart"/>
+      <w:r>
+        <w:rPr>
+          <w:sz w:val="24"/>
+          <w:szCs w:val="24"/>
+        </w:rPr>
+        <w:t>softmax</w:t>
+      </w:r>
+      <w:proofErr w:type="spellEnd"/>
+      <w:r>
+        <w:rPr>
+          <w:sz w:val="24"/>
+          <w:szCs w:val="24"/>
+        </w:rPr>
+        <w:t xml:space="preserve"> per trasformare le distanze in probabilità di appartenenza alle classi.</w:t>
+      </w:r>
+    </w:p>
+    <w:p>
+      <w:pPr>
+        <w:jc w:val="both"/>
+        <w:rPr>
+          <w:sz w:val="24"/>
+          <w:szCs w:val="24"/>
+        </w:rPr>
+      </w:pPr>
+      <w:r>
+        <w:rPr>
+          <w:sz w:val="24"/>
+          <w:szCs w:val="24"/>
+        </w:rPr>
+        <w:t xml:space="preserve">Per quanto riguarda tecniche effettive di learning, andrebbe fatta una scelta, innanzitutto per quanto riguarda la </w:t>
+      </w:r>
+      <w:proofErr w:type="spellStart"/>
+      <w:r>
+        <w:rPr>
+          <w:sz w:val="24"/>
+          <w:szCs w:val="24"/>
+        </w:rPr>
+        <w:t>loss</w:t>
+      </w:r>
+      <w:proofErr w:type="spellEnd"/>
+      <w:r>
+        <w:rPr>
+          <w:sz w:val="24"/>
+          <w:szCs w:val="24"/>
+        </w:rPr>
+        <w:t xml:space="preserve"> mi vengono in mente due alternative principalmente:</w:t>
+      </w:r>
+    </w:p>
+    <w:p>
+      <w:pPr>
+        <w:pStyle w:val="Paragrafoelenco"/>
+        <w:numPr>
+          <w:ilvl w:val="0"/>
+          <w:numId w:val="16"/>
+        </w:numPr>
+        <w:jc w:val="both"/>
+        <w:rPr>
+          <w:sz w:val="24"/>
+          <w:szCs w:val="24"/>
+        </w:rPr>
+      </w:pPr>
+      <w:r>
+        <w:rPr>
+          <w:sz w:val="24"/>
+          <w:szCs w:val="24"/>
+        </w:rPr>
+        <w:t>Cross-</w:t>
+      </w:r>
+      <w:proofErr w:type="spellStart"/>
+      <w:r>
+        <w:rPr>
+          <w:sz w:val="24"/>
+          <w:szCs w:val="24"/>
+        </w:rPr>
+        <w:t>entropy</w:t>
+      </w:r>
+      <w:proofErr w:type="spellEnd"/>
+      <w:r>
+        <w:rPr>
+          <w:sz w:val="24"/>
+          <w:szCs w:val="24"/>
+        </w:rPr>
+        <w:t xml:space="preserve"> </w:t>
+      </w:r>
+      <w:proofErr w:type="spellStart"/>
+      <w:r>
+        <w:rPr>
+          <w:sz w:val="24"/>
+          <w:szCs w:val="24"/>
+        </w:rPr>
+        <w:t>loss</w:t>
+      </w:r>
+      <w:proofErr w:type="spellEnd"/>
+      <w:r>
+        <w:rPr>
+          <w:sz w:val="24"/>
+          <w:szCs w:val="24"/>
+        </w:rPr>
+        <w:t>: Suggerita anche da</w:t>
+      </w:r>
+      <w:r>
+        <w:rPr>
+          <w:sz w:val="24"/>
+          <w:szCs w:val="24"/>
+        </w:rPr>
+        <w:t xml:space="preserve">l </w:t>
+      </w:r>
+      <w:proofErr w:type="spellStart"/>
+      <w:proofErr w:type="gramStart"/>
+      <w:r>
+        <w:rPr>
+          <w:sz w:val="24"/>
+          <w:szCs w:val="24"/>
+        </w:rPr>
+        <w:t>Dr.Carnemolla</w:t>
+      </w:r>
+      <w:proofErr w:type="spellEnd"/>
+      <w:proofErr w:type="gramEnd"/>
+      <w:r>
+        <w:rPr>
+          <w:sz w:val="24"/>
+          <w:szCs w:val="24"/>
+        </w:rPr>
+        <w:t xml:space="preserve">, è un classico e molto usata anche in ambito </w:t>
+      </w:r>
+      <w:proofErr w:type="spellStart"/>
+      <w:r>
+        <w:rPr>
+          <w:sz w:val="24"/>
+          <w:szCs w:val="24"/>
+        </w:rPr>
+        <w:t>few</w:t>
+      </w:r>
+      <w:proofErr w:type="spellEnd"/>
+      <w:r>
+        <w:rPr>
+          <w:sz w:val="24"/>
+          <w:szCs w:val="24"/>
+        </w:rPr>
+        <w:t xml:space="preserve"> shot learning.</w:t>
+      </w:r>
+    </w:p>
+    <w:p>
+      <w:pPr>
+        <w:pStyle w:val="Paragrafoelenco"/>
+        <w:numPr>
+          <w:ilvl w:val="0"/>
+          <w:numId w:val="16"/>
+        </w:numPr>
+        <w:jc w:val="both"/>
+        <w:rPr>
+          <w:sz w:val="24"/>
+          <w:szCs w:val="24"/>
+        </w:rPr>
+      </w:pPr>
+      <w:proofErr w:type="spellStart"/>
+      <w:r>
+        <w:rPr>
+          <w:sz w:val="24"/>
+          <w:szCs w:val="24"/>
+        </w:rPr>
+        <w:t>Triplet</w:t>
+      </w:r>
+      <w:proofErr w:type="spellEnd"/>
+      <w:r>
+        <w:rPr>
+          <w:sz w:val="24"/>
+          <w:szCs w:val="24"/>
+        </w:rPr>
+        <w:t xml:space="preserve"> </w:t>
+      </w:r>
+      <w:proofErr w:type="spellStart"/>
+      <w:r>
+        <w:rPr>
+          <w:sz w:val="24"/>
+          <w:szCs w:val="24"/>
+        </w:rPr>
+        <w:t>loss</w:t>
+      </w:r>
+      <w:proofErr w:type="spellEnd"/>
+      <w:r>
+        <w:rPr>
+          <w:sz w:val="24"/>
+          <w:szCs w:val="24"/>
+        </w:rPr>
+        <w:t>: Metrica che forza</w:t>
+      </w:r>
+      <w:r>
+        <w:rPr>
+          <w:sz w:val="24"/>
+          <w:szCs w:val="24"/>
+        </w:rPr>
+        <w:t xml:space="preserve"> il modello a ridurre la distanza tra eventi simili e aumentare la distanza tra eventi dissimili. Massimizziamo cosi la differenza tra le rappresentazioni (</w:t>
+      </w:r>
+      <w:proofErr w:type="spellStart"/>
+      <w:r>
+        <w:rPr>
+          <w:sz w:val="24"/>
+          <w:szCs w:val="24"/>
+        </w:rPr>
+        <w:t>embedding</w:t>
+      </w:r>
+      <w:proofErr w:type="spellEnd"/>
+      <w:r>
+        <w:rPr>
+          <w:sz w:val="24"/>
+          <w:szCs w:val="24"/>
+        </w:rPr>
+        <w:t>).</w:t>
+      </w:r>
+    </w:p>
+    <w:p>
+      <w:pPr>
+        <w:jc w:val="center"/>
+        <w:rPr>
+          <w:b/>
+          <w:bCs/>
+          <w:sz w:val="30"/>
+          <w:szCs w:val="30"/>
+        </w:rPr>
+      </w:pPr>
+    </w:p>
+    <w:p>
+      <w:pPr>
+        <w:jc w:val="center"/>
+        <w:rPr>
+          <w:b/>
+          <w:bCs/>
+          <w:sz w:val="30"/>
+          <w:szCs w:val="30"/>
+        </w:rPr>
+      </w:pPr>
+    </w:p>
+    <w:p>
+      <w:pPr>
+        <w:jc w:val="center"/>
+        <w:rPr>
+          <w:b/>
+          <w:bCs/>
+          <w:sz w:val="30"/>
+          <w:szCs w:val="30"/>
+        </w:rPr>
+      </w:pPr>
+    </w:p>
+    <w:p>
+      <w:pPr>
+        <w:jc w:val="center"/>
+        <w:rPr>
+          <w:b/>
+          <w:bCs/>
+          <w:sz w:val="30"/>
+          <w:szCs w:val="30"/>
+        </w:rPr>
+      </w:pPr>
+    </w:p>
+    <w:p>
+      <w:pPr>
+        <w:jc w:val="center"/>
+        <w:rPr>
+          <w:b/>
+          <w:bCs/>
+          <w:sz w:val="30"/>
+          <w:szCs w:val="30"/>
+        </w:rPr>
+      </w:pPr>
+      <w:r>
+        <w:rPr>
+          <w:b/>
+          <w:bCs/>
+          <w:sz w:val="30"/>
+          <w:szCs w:val="30"/>
+        </w:rPr>
+        <w:lastRenderedPageBreak/>
+        <w:t>Tecniche usate dai vincitori degli scorsi 2 anni</w:t>
+      </w:r>
+    </w:p>
+    <w:p>
+      <w:pPr>
+        <w:pStyle w:val="Paragrafoelenco"/>
+        <w:numPr>
+          <w:ilvl w:val="0"/>
+          <w:numId w:val="7"/>
+        </w:numPr>
+        <w:jc w:val="both"/>
+        <w:rPr>
+          <w:sz w:val="24"/>
+          <w:szCs w:val="24"/>
+        </w:rPr>
+      </w:pPr>
+      <w:r>
+        <w:rPr>
+          <w:sz w:val="24"/>
+          <w:szCs w:val="24"/>
+        </w:rPr>
+        <w:t xml:space="preserve">Usano la PCEN, cioè </w:t>
+      </w:r>
+      <w:r>
+        <w:rPr>
+          <w:sz w:val="24"/>
+          <w:szCs w:val="24"/>
+        </w:rPr>
+        <w:t xml:space="preserve">Per-Channel Energy </w:t>
+      </w:r>
+      <w:proofErr w:type="spellStart"/>
+      <w:r>
+        <w:rPr>
+          <w:sz w:val="24"/>
+          <w:szCs w:val="24"/>
+        </w:rPr>
+        <w:t>Normalization</w:t>
+      </w:r>
+      <w:proofErr w:type="spellEnd"/>
+      <w:r>
+        <w:rPr>
+          <w:sz w:val="24"/>
+          <w:szCs w:val="24"/>
+        </w:rPr>
+        <w:t xml:space="preserve">, una tecnica di </w:t>
+      </w:r>
+      <w:proofErr w:type="spellStart"/>
+      <w:r>
+        <w:rPr>
+          <w:sz w:val="24"/>
+          <w:szCs w:val="24"/>
+        </w:rPr>
+        <w:t>signal</w:t>
+      </w:r>
+      <w:proofErr w:type="spellEnd"/>
+      <w:r>
+        <w:rPr>
+          <w:sz w:val="24"/>
+          <w:szCs w:val="24"/>
+        </w:rPr>
+        <w:t xml:space="preserve"> processing che migliora le feature contenute in un audio, ergo massimizza l’</w:t>
+      </w:r>
+      <w:proofErr w:type="spellStart"/>
+      <w:r>
+        <w:rPr>
+          <w:sz w:val="24"/>
+          <w:szCs w:val="24"/>
+        </w:rPr>
+        <w:t>informatività</w:t>
+      </w:r>
+      <w:proofErr w:type="spellEnd"/>
+      <w:r>
+        <w:rPr>
+          <w:sz w:val="24"/>
+          <w:szCs w:val="24"/>
+        </w:rPr>
+        <w:t xml:space="preserve"> degli eventi. La PCEN è usata sugli spettrogrammi. Aumenta resistenza al rumore. Dal punto di vista pratico fa una un controllo del guadagno adattivo in base all’energia nel </w:t>
+      </w:r>
+      <w:proofErr w:type="spellStart"/>
+      <w:r>
+        <w:rPr>
+          <w:sz w:val="24"/>
+          <w:szCs w:val="24"/>
+        </w:rPr>
+        <w:t>mel</w:t>
+      </w:r>
+      <w:proofErr w:type="spellEnd"/>
+      <w:r>
+        <w:rPr>
+          <w:sz w:val="24"/>
+          <w:szCs w:val="24"/>
+        </w:rPr>
+        <w:t xml:space="preserve"> bin e nei dintorni.</w:t>
+      </w:r>
+    </w:p>
+    <w:p>
+      <w:pPr>
+        <w:pStyle w:val="Paragrafoelenco"/>
+        <w:numPr>
+          <w:ilvl w:val="0"/>
+          <w:numId w:val="7"/>
+        </w:numPr>
+        <w:jc w:val="both"/>
+        <w:rPr>
+          <w:sz w:val="24"/>
+          <w:szCs w:val="24"/>
+        </w:rPr>
+      </w:pPr>
+      <w:r>
+        <w:rPr>
+          <w:sz w:val="24"/>
+          <w:szCs w:val="24"/>
+        </w:rPr>
+        <w:t>Fanno un framing adattivo che cambia in base alla durata degli eventi del support set.</w:t>
+      </w:r>
+    </w:p>
+    <w:p>
+      <w:pPr>
+        <w:pStyle w:val="Paragrafoelenco"/>
+        <w:numPr>
+          <w:ilvl w:val="0"/>
+          <w:numId w:val="7"/>
+        </w:numPr>
+        <w:jc w:val="both"/>
+        <w:rPr>
+          <w:sz w:val="24"/>
+          <w:szCs w:val="24"/>
+        </w:rPr>
+      </w:pPr>
+      <w:r>
+        <w:rPr>
+          <w:sz w:val="24"/>
+          <w:szCs w:val="24"/>
+        </w:rPr>
+        <w:t>Fanno due step</w:t>
+      </w:r>
+      <w:r>
+        <w:rPr>
+          <w:sz w:val="24"/>
+          <w:szCs w:val="24"/>
+        </w:rPr>
+        <w:t xml:space="preserve"> nel fine tuning</w:t>
+      </w:r>
+      <w:r>
+        <w:rPr>
+          <w:sz w:val="24"/>
+          <w:szCs w:val="24"/>
+        </w:rPr>
+        <w:t xml:space="preserve">, nel primo </w:t>
+      </w:r>
+      <w:proofErr w:type="spellStart"/>
+      <w:r>
+        <w:rPr>
+          <w:sz w:val="24"/>
+          <w:szCs w:val="24"/>
+        </w:rPr>
+        <w:t>onsiderano</w:t>
+      </w:r>
+      <w:proofErr w:type="spellEnd"/>
+      <w:r>
+        <w:rPr>
+          <w:sz w:val="24"/>
+          <w:szCs w:val="24"/>
+        </w:rPr>
+        <w:t xml:space="preserve"> i 5 shot del support set </w:t>
+      </w:r>
+      <w:proofErr w:type="gramStart"/>
+      <w:r>
+        <w:rPr>
+          <w:sz w:val="24"/>
+          <w:szCs w:val="24"/>
+        </w:rPr>
+        <w:t>il positive</w:t>
+      </w:r>
+      <w:proofErr w:type="gramEnd"/>
+      <w:r>
+        <w:rPr>
+          <w:sz w:val="24"/>
+          <w:szCs w:val="24"/>
+        </w:rPr>
+        <w:t xml:space="preserve"> set e i quattro intermezzi tra gli eventi positivi il negative set. Usano la Cross-</w:t>
+      </w:r>
+      <w:proofErr w:type="spellStart"/>
+      <w:r>
+        <w:rPr>
+          <w:sz w:val="24"/>
+          <w:szCs w:val="24"/>
+        </w:rPr>
+        <w:t>entropy</w:t>
+      </w:r>
+      <w:proofErr w:type="spellEnd"/>
+      <w:r>
+        <w:rPr>
+          <w:sz w:val="24"/>
+          <w:szCs w:val="24"/>
+        </w:rPr>
+        <w:t xml:space="preserve"> </w:t>
+      </w:r>
+      <w:proofErr w:type="spellStart"/>
+      <w:r>
+        <w:rPr>
+          <w:sz w:val="24"/>
+          <w:szCs w:val="24"/>
+        </w:rPr>
+        <w:t>loss</w:t>
+      </w:r>
+      <w:proofErr w:type="spellEnd"/>
+      <w:r>
+        <w:rPr>
+          <w:sz w:val="24"/>
+          <w:szCs w:val="24"/>
+        </w:rPr>
+        <w:t xml:space="preserve"> per distinguere tra POS e NEG per la classe.</w:t>
+      </w:r>
+    </w:p>
+    <w:p>
+      <w:pPr>
+        <w:pStyle w:val="Paragrafoelenco"/>
+        <w:jc w:val="both"/>
+        <w:rPr>
+          <w:sz w:val="24"/>
+          <w:szCs w:val="24"/>
+        </w:rPr>
+      </w:pPr>
+      <w:r>
+        <w:rPr>
+          <w:sz w:val="24"/>
+          <w:szCs w:val="24"/>
+        </w:rPr>
+        <w:t xml:space="preserve">Nel secondo tramite una </w:t>
+      </w:r>
+      <w:proofErr w:type="gramStart"/>
+      <w:r>
+        <w:rPr>
+          <w:sz w:val="24"/>
+          <w:szCs w:val="24"/>
+        </w:rPr>
+        <w:t>soglia(</w:t>
+      </w:r>
+      <w:proofErr w:type="gramEnd"/>
+      <w:r>
+        <w:rPr>
+          <w:sz w:val="24"/>
+          <w:szCs w:val="24"/>
+        </w:rPr>
+        <w:t xml:space="preserve">alta by design) ottengono, usando il modello del primo step, le </w:t>
+      </w:r>
+      <w:proofErr w:type="spellStart"/>
+      <w:r>
+        <w:rPr>
+          <w:sz w:val="24"/>
+          <w:szCs w:val="24"/>
+        </w:rPr>
+        <w:t>posterior</w:t>
+      </w:r>
+      <w:proofErr w:type="spellEnd"/>
+      <w:r>
+        <w:rPr>
+          <w:sz w:val="24"/>
+          <w:szCs w:val="24"/>
+        </w:rPr>
+        <w:t xml:space="preserve"> </w:t>
+      </w:r>
+      <w:proofErr w:type="spellStart"/>
+      <w:r>
+        <w:rPr>
+          <w:sz w:val="24"/>
+          <w:szCs w:val="24"/>
+        </w:rPr>
+        <w:t>probabilities</w:t>
+      </w:r>
+      <w:proofErr w:type="spellEnd"/>
+      <w:r>
+        <w:rPr>
+          <w:sz w:val="24"/>
+          <w:szCs w:val="24"/>
+        </w:rPr>
+        <w:t xml:space="preserve"> cioè le probabilità di ogni query(frame) che sia classificato nelle varie classi. Cosi aumentano i dati a disposizione per il support </w:t>
+      </w:r>
+      <w:proofErr w:type="gramStart"/>
+      <w:r>
+        <w:rPr>
+          <w:sz w:val="24"/>
+          <w:szCs w:val="24"/>
+        </w:rPr>
+        <w:t>set,  che</w:t>
+      </w:r>
+      <w:proofErr w:type="gramEnd"/>
+      <w:r>
+        <w:rPr>
+          <w:sz w:val="24"/>
+          <w:szCs w:val="24"/>
+        </w:rPr>
+        <w:t xml:space="preserve"> sarà incrementato degli eventi che con altissima percentuale sono classificabili in una classe. Cosi in un loop di step1-&gt; step2 riescono a classificare sempre meglio le varie frame</w:t>
+      </w:r>
+      <w:r>
+        <w:rPr>
+          <w:sz w:val="24"/>
+          <w:szCs w:val="24"/>
+        </w:rPr>
+        <w:t>, fanno più fine-tuning iterativi</w:t>
+      </w:r>
+      <w:r>
+        <w:rPr>
+          <w:sz w:val="24"/>
+          <w:szCs w:val="24"/>
+        </w:rPr>
+        <w:t>.</w:t>
+      </w:r>
+      <w:r>
+        <w:rPr>
+          <w:sz w:val="24"/>
+          <w:szCs w:val="24"/>
+        </w:rPr>
+        <w:t xml:space="preserve"> Ottenevano nel 2022 una </w:t>
+      </w:r>
+      <w:r>
+        <w:rPr>
+          <w:sz w:val="24"/>
+          <w:szCs w:val="24"/>
+        </w:rPr>
+        <w:t>F1-score</w:t>
+      </w:r>
+      <w:r>
+        <w:rPr>
+          <w:sz w:val="24"/>
+          <w:szCs w:val="24"/>
+        </w:rPr>
+        <w:t xml:space="preserve"> </w:t>
+      </w:r>
+      <w:proofErr w:type="gramStart"/>
+      <w:r>
+        <w:rPr>
+          <w:sz w:val="24"/>
+          <w:szCs w:val="24"/>
+        </w:rPr>
+        <w:t>di</w:t>
+      </w:r>
+      <w:r>
+        <w:rPr>
+          <w:sz w:val="24"/>
+          <w:szCs w:val="24"/>
+        </w:rPr>
+        <w:t xml:space="preserve">  74.4</w:t>
+      </w:r>
+      <w:proofErr w:type="gramEnd"/>
+      <w:r>
+        <w:rPr>
+          <w:sz w:val="24"/>
+          <w:szCs w:val="24"/>
+        </w:rPr>
+        <w:t>%.</w:t>
+      </w:r>
+    </w:p>
+    <w:p>
+      <w:pPr>
+        <w:jc w:val="center"/>
+        <w:rPr>
+          <w:b/>
+          <w:bCs/>
+          <w:sz w:val="30"/>
+          <w:szCs w:val="30"/>
+        </w:rPr>
+      </w:pPr>
+      <w:r>
+        <w:rPr>
+          <w:noProof/>
+        </w:rPr>
+        <w:drawing>
+          <wp:inline distT="0" distB="0" distL="0" distR="0" wp14:anchorId="09E2A2A0" wp14:editId="0FD99C99">
+            <wp:extent cx="6120130" cy="3282950"/>
+            <wp:effectExtent l="0" t="0" r="0" b="0"/>
+            <wp:docPr id="1" name="Immagine 1"/>
+            <wp:cNvGraphicFramePr>
+              <a:graphicFrameLocks xmlns:a="http://schemas.openxmlformats.org/drawingml/2006/main" noChangeAspect="1"/>
+            </wp:cNvGraphicFramePr>
+            <a:graphic xmlns:a="http://schemas.openxmlformats.org/drawingml/2006/main">
+              <a:graphicData uri="http://schemas.openxmlformats.org/drawingml/2006/picture">
+                <pic:pic xmlns:pic="http://schemas.openxmlformats.org/drawingml/2006/picture">
+                  <pic:nvPicPr>
+                    <pic:cNvPr id="1" name=""/>
+                    <pic:cNvPicPr/>
+                  </pic:nvPicPr>
+                  <pic:blipFill>
+                    <a:blip r:embed="rId5"/>
+                    <a:stretch>
+                      <a:fillRect/>
+                    </a:stretch>
+                  </pic:blipFill>
+                  <pic:spPr>
+                    <a:xfrm>
+                      <a:off x="0" y="0"/>
+                      <a:ext cx="6120130" cy="3282950"/>
+                    </a:xfrm>
+                    <a:prstGeom prst="rect">
+                      <a:avLst/>
+                    </a:prstGeom>
+                  </pic:spPr>
+                </pic:pic>
+              </a:graphicData>
+            </a:graphic>
+          </wp:inline>
+        </w:drawing>
+      </w:r>
+    </w:p>
+    <w:p>
+      <w:pPr>
+        <w:jc w:val="both"/>
+        <w:rPr>
+          <w:b/>
+          <w:bCs/>
+          <w:sz w:val="30"/>
+          <w:szCs w:val="30"/>
+        </w:rPr>
+      </w:pPr>
+    </w:p>
+    <w:p>
+      <w:pPr>
+        <w:jc w:val="center"/>
+        <w:rPr>
+          <w:b/>
+          <w:bCs/>
+          <w:sz w:val="30"/>
+          <w:szCs w:val="30"/>
+        </w:rPr>
+      </w:pPr>
+      <w:r>
+        <w:rPr>
+          <w:b/>
+          <w:bCs/>
+          <w:sz w:val="30"/>
+          <w:szCs w:val="30"/>
+        </w:rPr>
+        <w:t>Considerazioni</w:t>
+      </w:r>
+    </w:p>
+    <w:p>
+      <w:pPr>
+        <w:jc w:val="center"/>
+        <w:rPr>
+          <w:b/>
+          <w:bCs/>
+          <w:sz w:val="30"/>
+          <w:szCs w:val="30"/>
+        </w:rPr>
+      </w:pPr>
+    </w:p>
+    <w:p>
+      <w:pPr>
+        <w:pStyle w:val="Paragrafoelenco"/>
+        <w:numPr>
+          <w:ilvl w:val="0"/>
+          <w:numId w:val="17"/>
+        </w:numPr>
+        <w:jc w:val="both"/>
+        <w:rPr>
+          <w:sz w:val="24"/>
+          <w:szCs w:val="24"/>
+        </w:rPr>
+      </w:pPr>
+      <w:r>
+        <w:rPr>
+          <w:sz w:val="24"/>
+          <w:szCs w:val="24"/>
+        </w:rPr>
+        <w:t xml:space="preserve">Bisogna scegliere se utilizzare un modello </w:t>
+      </w:r>
+      <w:proofErr w:type="spellStart"/>
+      <w:r>
+        <w:rPr>
+          <w:sz w:val="24"/>
+          <w:szCs w:val="24"/>
+        </w:rPr>
+        <w:t>pre</w:t>
+      </w:r>
+      <w:proofErr w:type="spellEnd"/>
+      <w:r>
+        <w:rPr>
+          <w:sz w:val="24"/>
+          <w:szCs w:val="24"/>
+        </w:rPr>
+        <w:t>-addestrato (CNN</w:t>
+      </w:r>
+      <w:proofErr w:type="gramStart"/>
+      <w:r>
+        <w:rPr>
+          <w:sz w:val="24"/>
+          <w:szCs w:val="24"/>
+        </w:rPr>
+        <w:t>14,Wav</w:t>
+      </w:r>
+      <w:proofErr w:type="gramEnd"/>
+      <w:r>
+        <w:rPr>
+          <w:sz w:val="24"/>
+          <w:szCs w:val="24"/>
+        </w:rPr>
+        <w:t xml:space="preserve">2Vec, </w:t>
+      </w:r>
+      <w:proofErr w:type="spellStart"/>
+      <w:r>
+        <w:rPr>
+          <w:sz w:val="24"/>
+          <w:szCs w:val="24"/>
+        </w:rPr>
+        <w:t>Ast</w:t>
+      </w:r>
+      <w:proofErr w:type="spellEnd"/>
+      <w:r>
+        <w:rPr>
+          <w:sz w:val="24"/>
+          <w:szCs w:val="24"/>
+        </w:rPr>
+        <w:t xml:space="preserve">..).  </w:t>
+      </w:r>
+    </w:p>
+    <w:p>
+      <w:pPr>
+        <w:ind w:left="1416"/>
+        <w:jc w:val="both"/>
+        <w:rPr>
+          <w:sz w:val="24"/>
+          <w:szCs w:val="24"/>
+        </w:rPr>
+      </w:pPr>
+      <w:r>
+        <w:rPr>
+          <w:sz w:val="24"/>
+          <w:szCs w:val="24"/>
+        </w:rPr>
+        <w:t>Pro: training più veloce (80% e oltre dei parametri freezati) e risorse computazionali minori</w:t>
+      </w:r>
+    </w:p>
+    <w:p>
+      <w:pPr>
+        <w:ind w:left="1416"/>
+        <w:jc w:val="both"/>
+        <w:rPr>
+          <w:sz w:val="24"/>
+          <w:szCs w:val="24"/>
+        </w:rPr>
+      </w:pPr>
+      <w:r>
+        <w:rPr>
+          <w:sz w:val="24"/>
+          <w:szCs w:val="24"/>
+        </w:rPr>
+        <w:t xml:space="preserve">Contro: </w:t>
+      </w:r>
+      <w:proofErr w:type="spellStart"/>
+      <w:r>
+        <w:rPr>
+          <w:sz w:val="24"/>
+          <w:szCs w:val="24"/>
+        </w:rPr>
+        <w:t>Bias</w:t>
+      </w:r>
+      <w:proofErr w:type="spellEnd"/>
+      <w:r>
+        <w:rPr>
+          <w:sz w:val="24"/>
+          <w:szCs w:val="24"/>
+        </w:rPr>
+        <w:t xml:space="preserve"> del dominio di origine, esistono modelli </w:t>
+      </w:r>
+      <w:proofErr w:type="spellStart"/>
+      <w:r>
+        <w:rPr>
+          <w:sz w:val="24"/>
+          <w:szCs w:val="24"/>
+        </w:rPr>
+        <w:t>pre</w:t>
+      </w:r>
+      <w:proofErr w:type="spellEnd"/>
+      <w:r>
+        <w:rPr>
+          <w:sz w:val="24"/>
+          <w:szCs w:val="24"/>
+        </w:rPr>
+        <w:t xml:space="preserve">-addestrati con un dominio simile al nostro sufficientemente per trasferire pesi utili? Non rischiamo di peggiorare </w:t>
+      </w:r>
+      <w:r>
+        <w:rPr>
+          <w:sz w:val="24"/>
+          <w:szCs w:val="24"/>
+        </w:rPr>
+        <w:lastRenderedPageBreak/>
+        <w:t xml:space="preserve">la situazione rispetto ad un modello totalmente nostro che usi ad esempio una </w:t>
+      </w:r>
+      <w:proofErr w:type="spellStart"/>
+      <w:r>
+        <w:rPr>
+          <w:sz w:val="24"/>
+          <w:szCs w:val="24"/>
+        </w:rPr>
+        <w:t>prototypical</w:t>
+      </w:r>
+      <w:proofErr w:type="spellEnd"/>
+      <w:r>
+        <w:rPr>
+          <w:sz w:val="24"/>
+          <w:szCs w:val="24"/>
+        </w:rPr>
+        <w:t xml:space="preserve"> network?</w:t>
+      </w:r>
+    </w:p>
+    <w:p>
+      <w:pPr>
+        <w:ind w:left="1416"/>
+        <w:jc w:val="both"/>
+        <w:rPr>
+          <w:sz w:val="24"/>
+          <w:szCs w:val="24"/>
+        </w:rPr>
+      </w:pPr>
+      <w:r>
+        <w:rPr>
+          <w:sz w:val="24"/>
+          <w:szCs w:val="24"/>
+        </w:rPr>
+        <w:t>Inoltre i team degli anni precedenti sembra che non le usino, ci sarà un motivo potremmo dire</w:t>
+      </w:r>
+    </w:p>
+    <w:p>
+      <w:pPr>
+        <w:pStyle w:val="Paragrafoelenco"/>
+        <w:numPr>
+          <w:ilvl w:val="0"/>
+          <w:numId w:val="17"/>
+        </w:numPr>
+        <w:jc w:val="both"/>
+        <w:rPr>
+          <w:b/>
+          <w:bCs/>
+          <w:sz w:val="24"/>
+          <w:szCs w:val="24"/>
+        </w:rPr>
+      </w:pPr>
+    </w:p>
+    <w:p>
+      <w:pPr>
+        <w:jc w:val="center"/>
+        <w:rPr>
+          <w:b/>
+          <w:bCs/>
+          <w:sz w:val="30"/>
+          <w:szCs w:val="30"/>
+        </w:rPr>
+      </w:pPr>
+    </w:p>
+    <w:p>
+      <w:pPr>
+        <w:jc w:val="center"/>
+        <w:rPr>
+          <w:b/>
+          <w:bCs/>
+          <w:sz w:val="30"/>
+          <w:szCs w:val="30"/>
+        </w:rPr>
+      </w:pPr>
+    </w:p>
+    <w:p>
+      <w:pPr>
+        <w:jc w:val="center"/>
+        <w:rPr>
+          <w:b/>
+          <w:bCs/>
+          <w:sz w:val="30"/>
+          <w:szCs w:val="30"/>
+        </w:rPr>
+      </w:pPr>
+    </w:p>
+    <w:p>
+      <w:pPr>
+        <w:jc w:val="center"/>
+        <w:rPr>
+          <w:b/>
+          <w:bCs/>
+          <w:sz w:val="30"/>
+          <w:szCs w:val="30"/>
+        </w:rPr>
+      </w:pPr>
+      <w:r>
+        <w:rPr>
+          <w:b/>
+          <w:bCs/>
+          <w:sz w:val="30"/>
+          <w:szCs w:val="30"/>
+        </w:rPr>
+        <w:t>Proprietà modelli consigliati finora</w:t>
+      </w:r>
+    </w:p>
+    <w:p>
+      <w:pPr>
+        <w:jc w:val="both"/>
+        <w:rPr>
+          <w:sz w:val="24"/>
+          <w:szCs w:val="24"/>
+        </w:rPr>
+      </w:pPr>
+      <w:r>
+        <w:rPr>
+          <w:b/>
+          <w:bCs/>
+          <w:sz w:val="24"/>
+          <w:szCs w:val="24"/>
+        </w:rPr>
+        <w:t>CNN</w:t>
+      </w:r>
+      <w:proofErr w:type="gramStart"/>
+      <w:r>
+        <w:rPr>
+          <w:b/>
+          <w:bCs/>
+          <w:sz w:val="24"/>
+          <w:szCs w:val="24"/>
+        </w:rPr>
+        <w:t>14</w:t>
+      </w:r>
+      <w:r>
+        <w:rPr>
+          <w:sz w:val="24"/>
+          <w:szCs w:val="24"/>
+        </w:rPr>
+        <w:t>:Rete</w:t>
+      </w:r>
+      <w:proofErr w:type="gramEnd"/>
+      <w:r>
+        <w:rPr>
+          <w:sz w:val="24"/>
+          <w:szCs w:val="24"/>
+        </w:rPr>
+        <w:t xml:space="preserve"> </w:t>
       </w:r>
       <w:proofErr w:type="spellStart"/>
       <w:r>
@@ -4062,19 +6021,21 @@
         </w:rPr>
         <w:t xml:space="preserve"> </w:t>
       </w:r>
-      <w:r>
-        <w:rPr>
-          <w:sz w:val="24"/>
-          <w:szCs w:val="24"/>
-        </w:rPr>
-        <w:t>STFT</w:t>
-      </w:r>
-      <w:r>
-        <w:rPr>
-          <w:sz w:val="24"/>
-          <w:szCs w:val="24"/>
-        </w:rPr>
-        <w:t xml:space="preserve">(ampiezza delle </w:t>
+      <w:proofErr w:type="gramStart"/>
+      <w:r>
+        <w:rPr>
+          <w:sz w:val="24"/>
+          <w:szCs w:val="24"/>
+        </w:rPr>
+        <w:t>STFT(</w:t>
+      </w:r>
+      <w:proofErr w:type="gramEnd"/>
+      <w:r>
+        <w:rPr>
+          <w:sz w:val="24"/>
+          <w:szCs w:val="24"/>
+        </w:rPr>
+        <w:t xml:space="preserve">ampiezza delle </w:t>
       </w:r>
       <w:proofErr w:type="spellStart"/>
       <w:r>
@@ -4107,6 +6068,7 @@
         </w:rPr>
       </w:pPr>
       <w:proofErr w:type="spellStart"/>
+      <w:proofErr w:type="gramStart"/>
       <w:r>
         <w:rPr>
           <w:sz w:val="24"/>
@@ -4122,19 +6084,13 @@
         </w:rPr>
         <w:t>(</w:t>
       </w:r>
-      <w:r>
-        <w:rPr>
-          <w:sz w:val="24"/>
-          <w:szCs w:val="24"/>
-        </w:rPr>
-        <w:t>energia delle 12 classi di pitch (o cromatiche) in un segmento temporale</w:t>
-      </w:r>
-      <w:r>
-        <w:rPr>
-          <w:sz w:val="24"/>
-          <w:szCs w:val="24"/>
-        </w:rPr>
-        <w:t xml:space="preserve"> </w:t>
+      <w:proofErr w:type="gramEnd"/>
+      <w:r>
+        <w:rPr>
+          <w:sz w:val="24"/>
+          <w:szCs w:val="24"/>
+        </w:rPr>
+        <w:t xml:space="preserve">energia delle 12 classi di pitch (o cromatiche) in un segmento temporale </w:t>
       </w:r>
     </w:p>
     <w:p>
@@ -4150,21 +6106,16 @@
           <w:szCs w:val="24"/>
         </w:rPr>
       </w:pPr>
-      <w:r>
-        <w:rPr>
-          <w:sz w:val="24"/>
-          <w:szCs w:val="24"/>
-        </w:rPr>
-        <w:t>CQT</w:t>
-      </w:r>
-      <w:r>
-        <w:rPr>
-          <w:sz w:val="24"/>
-          <w:szCs w:val="24"/>
-        </w:rPr>
-        <w:t>(</w:t>
-      </w:r>
-      <w:proofErr w:type="spellStart"/>
+      <w:proofErr w:type="gramStart"/>
+      <w:r>
+        <w:rPr>
+          <w:sz w:val="24"/>
+          <w:szCs w:val="24"/>
+        </w:rPr>
+        <w:t>CQT(</w:t>
+      </w:r>
+      <w:proofErr w:type="spellStart"/>
+      <w:proofErr w:type="gramEnd"/>
       <w:r>
         <w:rPr>
           <w:sz w:val="24"/>
@@ -4231,7 +6182,6 @@
           <w:sz w:val="24"/>
           <w:szCs w:val="24"/>
         </w:rPr>
-        <w:lastRenderedPageBreak/>
         <w:t xml:space="preserve">Ergo non funzionante con </w:t>
       </w:r>
       <w:r>
@@ -4255,14 +6205,7 @@
           <w:sz w:val="24"/>
           <w:szCs w:val="24"/>
         </w:rPr>
-        <w:t xml:space="preserve"> grezzi presenti nel mio codice, tuttavia si può fare un adattamento in tempi brevi (circa 2-3 ore al più)</w:t>
-      </w:r>
-      <w:r>
-        <w:rPr>
-          <w:sz w:val="24"/>
-          <w:szCs w:val="24"/>
-        </w:rPr>
-        <w:t>.</w:t>
+        <w:t xml:space="preserve"> grezzi presenti nel mio codice, tuttavia si può fare un adattamento in tempi brevi (circa 2-3 ore al più).</w:t>
       </w:r>
     </w:p>
     <w:p>
@@ -4341,7 +6284,23 @@
           <w:sz w:val="24"/>
           <w:szCs w:val="24"/>
         </w:rPr>
-        <w:t>batch_size,numero_bande_mel,numero_frame</w:t>
+        <w:t>batch_</w:t>
+      </w:r>
+      <w:proofErr w:type="gramStart"/>
+      <w:r>
+        <w:rPr>
+          <w:sz w:val="24"/>
+          <w:szCs w:val="24"/>
+        </w:rPr>
+        <w:t>size,numero</w:t>
+      </w:r>
+      <w:proofErr w:type="gramEnd"/>
+      <w:r>
+        <w:rPr>
+          <w:sz w:val="24"/>
+          <w:szCs w:val="24"/>
+        </w:rPr>
+        <w:t>_bande_mel,numero_frame</w:t>
       </w:r>
       <w:proofErr w:type="spellEnd"/>
       <w:r>
@@ -4503,7 +6462,23 @@
           <w:sz w:val="24"/>
           <w:szCs w:val="24"/>
         </w:rPr>
-        <w:t>Accetta come input gli audio grezzi, cioè i famosi campioni creati dal mio algoritmo, in formato 1D di dimensione dei campioni audio (o nel nostro caso delle frames)</w:t>
+        <w:t xml:space="preserve">Accetta come input gli audio grezzi, cioè i famosi campioni creati dal mio algoritmo, in formato 1D di dimensione dei campioni audio (o nel nostro caso </w:t>
+      </w:r>
+      <w:proofErr w:type="gramStart"/>
+      <w:r>
+        <w:rPr>
+          <w:sz w:val="24"/>
+          <w:szCs w:val="24"/>
+        </w:rPr>
+        <w:t>delle frames</w:t>
+      </w:r>
+      <w:proofErr w:type="gramEnd"/>
+      <w:r>
+        <w:rPr>
+          <w:sz w:val="24"/>
+          <w:szCs w:val="24"/>
+        </w:rPr>
+        <w:t>)</w:t>
       </w:r>
     </w:p>
     <w:p>
@@ -4555,7 +6530,7 @@
   <w:abstractNum w:abstractNumId="0" w15:restartNumberingAfterBreak="0">
     <w:nsid w:val="08B4109A"/>
     <w:multiLevelType w:val="hybridMultilevel"/>
-    <w:tmpl w:val="46F47C2A"/>
+    <w:tmpl w:val="F92CAB84"/>
     <w:lvl w:ilvl="0" w:tplc="04100001">
       <w:start w:val="1"/>
       <w:numFmt w:val="bullet"/>
@@ -5530,6 +7505,92 @@
     </w:lvl>
   </w:abstractNum>
   <w:abstractNum w:abstractNumId="10" w15:restartNumberingAfterBreak="0">
+    <w:nsid w:val="60D234B1"/>
+    <w:multiLevelType w:val="hybridMultilevel"/>
+    <w:tmpl w:val="415AA4B4"/>
+    <w:lvl w:ilvl="0" w:tplc="0410000F">
+      <w:start w:val="1"/>
+      <w:numFmt w:val="decimal"/>
+      <w:lvlText w:val="%1."/>
+      <w:lvlJc w:val="left"/>
+      <w:pPr>
+        <w:ind w:left="720" w:hanging="360"/>
+      </w:pPr>
+    </w:lvl>
+    <w:lvl w:ilvl="1" w:tplc="04100019" w:tentative="1">
+      <w:start w:val="1"/>
+      <w:numFmt w:val="lowerLetter"/>
+      <w:lvlText w:val="%2."/>
+      <w:lvlJc w:val="left"/>
+      <w:pPr>
+        <w:ind w:left="1440" w:hanging="360"/>
+      </w:pPr>
+    </w:lvl>
+    <w:lvl w:ilvl="2" w:tplc="0410001B" w:tentative="1">
+      <w:start w:val="1"/>
+      <w:numFmt w:val="lowerRoman"/>
+      <w:lvlText w:val="%3."/>
+      <w:lvlJc w:val="right"/>
+      <w:pPr>
+        <w:ind w:left="2160" w:hanging="180"/>
+      </w:pPr>
+    </w:lvl>
+    <w:lvl w:ilvl="3" w:tplc="0410000F" w:tentative="1">
+      <w:start w:val="1"/>
+      <w:numFmt w:val="decimal"/>
+      <w:lvlText w:val="%4."/>
+      <w:lvlJc w:val="left"/>
+      <w:pPr>
+        <w:ind w:left="2880" w:hanging="360"/>
+      </w:pPr>
+    </w:lvl>
+    <w:lvl w:ilvl="4" w:tplc="04100019" w:tentative="1">
+      <w:start w:val="1"/>
+      <w:numFmt w:val="lowerLetter"/>
+      <w:lvlText w:val="%5."/>
+      <w:lvlJc w:val="left"/>
+      <w:pPr>
+        <w:ind w:left="3600" w:hanging="360"/>
+      </w:pPr>
+    </w:lvl>
+    <w:lvl w:ilvl="5" w:tplc="0410001B" w:tentative="1">
+      <w:start w:val="1"/>
+      <w:numFmt w:val="lowerRoman"/>
+      <w:lvlText w:val="%6."/>
+      <w:lvlJc w:val="right"/>
+      <w:pPr>
+        <w:ind w:left="4320" w:hanging="180"/>
+      </w:pPr>
+    </w:lvl>
+    <w:lvl w:ilvl="6" w:tplc="0410000F" w:tentative="1">
+      <w:start w:val="1"/>
+      <w:numFmt w:val="decimal"/>
+      <w:lvlText w:val="%7."/>
+      <w:lvlJc w:val="left"/>
+      <w:pPr>
+        <w:ind w:left="5040" w:hanging="360"/>
+      </w:pPr>
+    </w:lvl>
+    <w:lvl w:ilvl="7" w:tplc="04100019" w:tentative="1">
+      <w:start w:val="1"/>
+      <w:numFmt w:val="lowerLetter"/>
+      <w:lvlText w:val="%8."/>
+      <w:lvlJc w:val="left"/>
+      <w:pPr>
+        <w:ind w:left="5760" w:hanging="360"/>
+      </w:pPr>
+    </w:lvl>
+    <w:lvl w:ilvl="8" w:tplc="0410001B" w:tentative="1">
+      <w:start w:val="1"/>
+      <w:numFmt w:val="lowerRoman"/>
+      <w:lvlText w:val="%9."/>
+      <w:lvlJc w:val="right"/>
+      <w:pPr>
+        <w:ind w:left="6480" w:hanging="180"/>
+      </w:pPr>
+    </w:lvl>
+  </w:abstractNum>
+  <w:abstractNum w:abstractNumId="11" w15:restartNumberingAfterBreak="0">
     <w:nsid w:val="65007E59"/>
     <w:multiLevelType w:val="hybridMultilevel"/>
     <w:tmpl w:val="1402D5E8"/>
@@ -5615,7 +7676,7 @@
       </w:pPr>
     </w:lvl>
   </w:abstractNum>
-  <w:abstractNum w:abstractNumId="11" w15:restartNumberingAfterBreak="0">
+  <w:abstractNum w:abstractNumId="12" w15:restartNumberingAfterBreak="0">
     <w:nsid w:val="6CD8627E"/>
     <w:multiLevelType w:val="hybridMultilevel"/>
     <w:tmpl w:val="7D406B28"/>
@@ -5728,7 +7789,206 @@
       </w:rPr>
     </w:lvl>
   </w:abstractNum>
-  <w:abstractNum w:abstractNumId="12" w15:restartNumberingAfterBreak="0">
+  <w:abstractNum w:abstractNumId="13" w15:restartNumberingAfterBreak="0">
+    <w:nsid w:val="6F431D1A"/>
+    <w:multiLevelType w:val="hybridMultilevel"/>
+    <w:tmpl w:val="4AA04884"/>
+    <w:lvl w:ilvl="0" w:tplc="04100001">
+      <w:start w:val="1"/>
+      <w:numFmt w:val="bullet"/>
+      <w:lvlText w:val=""/>
+      <w:lvlJc w:val="left"/>
+      <w:pPr>
+        <w:ind w:left="720" w:hanging="360"/>
+      </w:pPr>
+      <w:rPr>
+        <w:rFonts w:ascii="Symbol" w:hAnsi="Symbol" w:hint="default"/>
+      </w:rPr>
+    </w:lvl>
+    <w:lvl w:ilvl="1" w:tplc="04100003" w:tentative="1">
+      <w:start w:val="1"/>
+      <w:numFmt w:val="bullet"/>
+      <w:lvlText w:val="o"/>
+      <w:lvlJc w:val="left"/>
+      <w:pPr>
+        <w:ind w:left="1440" w:hanging="360"/>
+      </w:pPr>
+      <w:rPr>
+        <w:rFonts w:ascii="Courier New" w:hAnsi="Courier New" w:cs="Courier New" w:hint="default"/>
+      </w:rPr>
+    </w:lvl>
+    <w:lvl w:ilvl="2" w:tplc="04100005" w:tentative="1">
+      <w:start w:val="1"/>
+      <w:numFmt w:val="bullet"/>
+      <w:lvlText w:val=""/>
+      <w:lvlJc w:val="left"/>
+      <w:pPr>
+        <w:ind w:left="2160" w:hanging="360"/>
+      </w:pPr>
+      <w:rPr>
+        <w:rFonts w:ascii="Wingdings" w:hAnsi="Wingdings" w:hint="default"/>
+      </w:rPr>
+    </w:lvl>
+    <w:lvl w:ilvl="3" w:tplc="04100001" w:tentative="1">
+      <w:start w:val="1"/>
+      <w:numFmt w:val="bullet"/>
+      <w:lvlText w:val=""/>
+      <w:lvlJc w:val="left"/>
+      <w:pPr>
+        <w:ind w:left="2880" w:hanging="360"/>
+      </w:pPr>
+      <w:rPr>
+        <w:rFonts w:ascii="Symbol" w:hAnsi="Symbol" w:hint="default"/>
+      </w:rPr>
+    </w:lvl>
+    <w:lvl w:ilvl="4" w:tplc="04100003" w:tentative="1">
+      <w:start w:val="1"/>
+      <w:numFmt w:val="bullet"/>
+      <w:lvlText w:val="o"/>
+      <w:lvlJc w:val="left"/>
+      <w:pPr>
+        <w:ind w:left="3600" w:hanging="360"/>
+      </w:pPr>
+      <w:rPr>
+        <w:rFonts w:ascii="Courier New" w:hAnsi="Courier New" w:cs="Courier New" w:hint="default"/>
+      </w:rPr>
+    </w:lvl>
+    <w:lvl w:ilvl="5" w:tplc="04100005" w:tentative="1">
+      <w:start w:val="1"/>
+      <w:numFmt w:val="bullet"/>
+      <w:lvlText w:val=""/>
+      <w:lvlJc w:val="left"/>
+      <w:pPr>
+        <w:ind w:left="4320" w:hanging="360"/>
+      </w:pPr>
+      <w:rPr>
+        <w:rFonts w:ascii="Wingdings" w:hAnsi="Wingdings" w:hint="default"/>
+      </w:rPr>
+    </w:lvl>
+    <w:lvl w:ilvl="6" w:tplc="04100001" w:tentative="1">
+      <w:start w:val="1"/>
+      <w:numFmt w:val="bullet"/>
+      <w:lvlText w:val=""/>
+      <w:lvlJc w:val="left"/>
+      <w:pPr>
+        <w:ind w:left="5040" w:hanging="360"/>
+      </w:pPr>
+      <w:rPr>
+        <w:rFonts w:ascii="Symbol" w:hAnsi="Symbol" w:hint="default"/>
+      </w:rPr>
+    </w:lvl>
+    <w:lvl w:ilvl="7" w:tplc="04100003" w:tentative="1">
+      <w:start w:val="1"/>
+      <w:numFmt w:val="bullet"/>
+      <w:lvlText w:val="o"/>
+      <w:lvlJc w:val="left"/>
+      <w:pPr>
+        <w:ind w:left="5760" w:hanging="360"/>
+      </w:pPr>
+      <w:rPr>
+        <w:rFonts w:ascii="Courier New" w:hAnsi="Courier New" w:cs="Courier New" w:hint="default"/>
+      </w:rPr>
+    </w:lvl>
+    <w:lvl w:ilvl="8" w:tplc="04100005" w:tentative="1">
+      <w:start w:val="1"/>
+      <w:numFmt w:val="bullet"/>
+      <w:lvlText w:val=""/>
+      <w:lvlJc w:val="left"/>
+      <w:pPr>
+        <w:ind w:left="6480" w:hanging="360"/>
+      </w:pPr>
+      <w:rPr>
+        <w:rFonts w:ascii="Wingdings" w:hAnsi="Wingdings" w:hint="default"/>
+      </w:rPr>
+    </w:lvl>
+  </w:abstractNum>
+  <w:abstractNum w:abstractNumId="14" w15:restartNumberingAfterBreak="0">
+    <w:nsid w:val="7D0A37EF"/>
+    <w:multiLevelType w:val="hybridMultilevel"/>
+    <w:tmpl w:val="FC3C2B9C"/>
+    <w:lvl w:ilvl="0" w:tplc="0410000F">
+      <w:start w:val="1"/>
+      <w:numFmt w:val="decimal"/>
+      <w:lvlText w:val="%1."/>
+      <w:lvlJc w:val="left"/>
+      <w:pPr>
+        <w:ind w:left="780" w:hanging="360"/>
+      </w:pPr>
+    </w:lvl>
+    <w:lvl w:ilvl="1" w:tplc="04100019" w:tentative="1">
+      <w:start w:val="1"/>
+      <w:numFmt w:val="lowerLetter"/>
+      <w:lvlText w:val="%2."/>
+      <w:lvlJc w:val="left"/>
+      <w:pPr>
+        <w:ind w:left="1500" w:hanging="360"/>
+      </w:pPr>
+    </w:lvl>
+    <w:lvl w:ilvl="2" w:tplc="0410001B" w:tentative="1">
+      <w:start w:val="1"/>
+      <w:numFmt w:val="lowerRoman"/>
+      <w:lvlText w:val="%3."/>
+      <w:lvlJc w:val="right"/>
+      <w:pPr>
+        <w:ind w:left="2220" w:hanging="180"/>
+      </w:pPr>
+    </w:lvl>
+    <w:lvl w:ilvl="3" w:tplc="0410000F" w:tentative="1">
+      <w:start w:val="1"/>
+      <w:numFmt w:val="decimal"/>
+      <w:lvlText w:val="%4."/>
+      <w:lvlJc w:val="left"/>
+      <w:pPr>
+        <w:ind w:left="2940" w:hanging="360"/>
+      </w:pPr>
+    </w:lvl>
+    <w:lvl w:ilvl="4" w:tplc="04100019" w:tentative="1">
+      <w:start w:val="1"/>
+      <w:numFmt w:val="lowerLetter"/>
+      <w:lvlText w:val="%5."/>
+      <w:lvlJc w:val="left"/>
+      <w:pPr>
+        <w:ind w:left="3660" w:hanging="360"/>
+      </w:pPr>
+    </w:lvl>
+    <w:lvl w:ilvl="5" w:tplc="0410001B" w:tentative="1">
+      <w:start w:val="1"/>
+      <w:numFmt w:val="lowerRoman"/>
+      <w:lvlText w:val="%6."/>
+      <w:lvlJc w:val="right"/>
+      <w:pPr>
+        <w:ind w:left="4380" w:hanging="180"/>
+      </w:pPr>
+    </w:lvl>
+    <w:lvl w:ilvl="6" w:tplc="0410000F" w:tentative="1">
+      <w:start w:val="1"/>
+      <w:numFmt w:val="decimal"/>
+      <w:lvlText w:val="%7."/>
+      <w:lvlJc w:val="left"/>
+      <w:pPr>
+        <w:ind w:left="5100" w:hanging="360"/>
+      </w:pPr>
+    </w:lvl>
+    <w:lvl w:ilvl="7" w:tplc="04100019" w:tentative="1">
+      <w:start w:val="1"/>
+      <w:numFmt w:val="lowerLetter"/>
+      <w:lvlText w:val="%8."/>
+      <w:lvlJc w:val="left"/>
+      <w:pPr>
+        <w:ind w:left="5820" w:hanging="360"/>
+      </w:pPr>
+    </w:lvl>
+    <w:lvl w:ilvl="8" w:tplc="0410001B" w:tentative="1">
+      <w:start w:val="1"/>
+      <w:numFmt w:val="lowerRoman"/>
+      <w:lvlText w:val="%9."/>
+      <w:lvlJc w:val="right"/>
+      <w:pPr>
+        <w:ind w:left="6540" w:hanging="180"/>
+      </w:pPr>
+    </w:lvl>
+  </w:abstractNum>
+  <w:abstractNum w:abstractNumId="15" w15:restartNumberingAfterBreak="0">
     <w:nsid w:val="7D5626E3"/>
     <w:multiLevelType w:val="hybridMultilevel"/>
     <w:tmpl w:val="1E54F74E"/>
@@ -5841,7 +8101,7 @@
       </w:rPr>
     </w:lvl>
   </w:abstractNum>
-  <w:abstractNum w:abstractNumId="13" w15:restartNumberingAfterBreak="0">
+  <w:abstractNum w:abstractNumId="16" w15:restartNumberingAfterBreak="0">
     <w:nsid w:val="7F041D53"/>
     <w:multiLevelType w:val="hybridMultilevel"/>
     <w:tmpl w:val="A606E2A8"/>
@@ -5928,7 +8188,7 @@
     </w:lvl>
   </w:abstractNum>
   <w:num w:numId="1">
-    <w:abstractNumId w:val="12"/>
+    <w:abstractNumId w:val="15"/>
   </w:num>
   <w:num w:numId="2">
     <w:abstractNumId w:val="5"/>
@@ -5937,7 +8197,7 @@
     <w:abstractNumId w:val="9"/>
   </w:num>
   <w:num w:numId="4">
-    <w:abstractNumId w:val="11"/>
+    <w:abstractNumId w:val="12"/>
   </w:num>
   <w:num w:numId="5">
     <w:abstractNumId w:val="4"/>
@@ -5958,16 +8218,25 @@
     <w:abstractNumId w:val="7"/>
   </w:num>
   <w:num w:numId="11">
-    <w:abstractNumId w:val="13"/>
+    <w:abstractNumId w:val="16"/>
   </w:num>
   <w:num w:numId="12">
     <w:abstractNumId w:val="2"/>
   </w:num>
   <w:num w:numId="13">
-    <w:abstractNumId w:val="10"/>
+    <w:abstractNumId w:val="11"/>
   </w:num>
   <w:num w:numId="14">
     <w:abstractNumId w:val="1"/>
+  </w:num>
+  <w:num w:numId="15">
+    <w:abstractNumId w:val="14"/>
+  </w:num>
+  <w:num w:numId="16">
+    <w:abstractNumId w:val="10"/>
+  </w:num>
+  <w:num w:numId="17">
+    <w:abstractNumId w:val="13"/>
   </w:num>
 </w:numbering>
 </file>

</xml_diff>